<commit_message>
feat(pm): Add Trello sprint board screenshot and 8-week delivery Gantt chart
</commit_message>
<xml_diff>
--- a/Final_Project_Report.docx
+++ b/Final_Project_Report.docx
@@ -2984,7 +2984,95 @@
           <w:color w:val="000000"/>
           <w:sz w:val="24"/>
         </w:rPr>
-        <w:t>Sprint 1 focused on delivering foundational operational capabilities: User Authentication (WMS-01), Stock Intake (WMS-02), Barcode Scanning (WMS-03), and Stock Level Checking (WMS-04), representing 13 total Story Points. The team conducted weekly sprint reviews to evaluate deliverables against acceptance criteria. Figure 5 illustrates our project delivery timeline using a structured Gantt Chart spanning Sprints 1 through 4.</w:t>
+        <w:t>Sprint 1 focused on delivering foundational operational capabilities: User Authentication (WMS-01), Stock Intake (WMS-02), Barcode Scanning (WMS-03), and Stock Level Checking (WMS-04), representing 13 total Story Points. The team conducted weekly sprint reviews to evaluate deliverables against acceptance criteria. Figure 6 illustrates our project delivery timeline using a structured Gantt Chart spanning Sprints 1 through 4.</w:t>
+      </w:r>
+    </w:p>
+    <w:p>
+      <w:pPr>
+        <w:spacing w:before="160" w:after="80" w:line="480" w:lineRule="auto"/>
+        <w:jc w:val="center"/>
+      </w:pPr>
+      <w:r>
+        <w:drawing>
+          <wp:inline xmlns:a="http://schemas.openxmlformats.org/drawingml/2006/main" xmlns:pic="http://schemas.openxmlformats.org/drawingml/2006/picture">
+            <wp:extent cx="5669280" cy="3173371"/>
+            <wp:docPr id="5" name="Picture 5"/>
+            <wp:cNvGraphicFramePr>
+              <a:graphicFrameLocks noChangeAspect="1"/>
+            </wp:cNvGraphicFramePr>
+            <a:graphic>
+              <a:graphicData uri="http://schemas.openxmlformats.org/drawingml/2006/picture">
+                <pic:pic>
+                  <pic:nvPicPr>
+                    <pic:cNvPr id="0" name="trello_sprint_board.png"/>
+                    <pic:cNvPicPr/>
+                  </pic:nvPicPr>
+                  <pic:blipFill>
+                    <a:blip r:embed="rId13"/>
+                    <a:stretch>
+                      <a:fillRect/>
+                    </a:stretch>
+                  </pic:blipFill>
+                  <pic:spPr>
+                    <a:xfrm>
+                      <a:off x="0" y="0"/>
+                      <a:ext cx="5669280" cy="3173371"/>
+                    </a:xfrm>
+                    <a:prstGeom prst="rect"/>
+                  </pic:spPr>
+                </pic:pic>
+              </a:graphicData>
+            </a:graphic>
+          </wp:inline>
+        </w:drawing>
+      </w:r>
+    </w:p>
+    <w:p>
+      <w:pPr>
+        <w:spacing w:before="80" w:after="40" w:line="480" w:lineRule="auto"/>
+        <w:ind w:firstLine="0"/>
+      </w:pPr>
+      <w:r>
+        <w:rPr>
+          <w:rFonts w:ascii="Times New Roman" w:hAnsi="Times New Roman"/>
+          <w:b/>
+          <w:i w:val="0"/>
+          <w:color w:val="000000"/>
+          <w:sz w:val="24"/>
+        </w:rPr>
+        <w:t>Figure 5</w:t>
+      </w:r>
+    </w:p>
+    <w:p>
+      <w:pPr>
+        <w:spacing w:before="0" w:after="120" w:line="480" w:lineRule="auto"/>
+        <w:ind w:firstLine="0"/>
+      </w:pPr>
+      <w:r>
+        <w:rPr>
+          <w:rFonts w:ascii="Times New Roman" w:hAnsi="Times New Roman"/>
+          <w:b w:val="0"/>
+          <w:i/>
+          <w:color w:val="000000"/>
+          <w:sz w:val="24"/>
+        </w:rPr>
+        <w:t>Agile Trello Sprint Board with Story Point Estimates and Task Workflow</w:t>
+      </w:r>
+    </w:p>
+    <w:p>
+      <w:pPr>
+        <w:spacing w:before="40" w:after="160" w:line="480" w:lineRule="auto"/>
+        <w:ind w:firstLine="720"/>
+      </w:pPr>
+      <w:r>
+        <w:rPr>
+          <w:rFonts w:ascii="Times New Roman" w:hAnsi="Times New Roman"/>
+          <w:b w:val="0"/>
+          <w:i w:val="0"/>
+          <w:color w:val="000000"/>
+          <w:sz w:val="24"/>
+        </w:rPr>
+        <w:t>Figure 5 illustrates our active Trello Kanban Sprint Board for the Warehouse Stock Inventory System. The board is structured into five distinct workflow swimlanes: Product Backlog, Sprint 1 Backlog, In Progress, QA &amp; Review, and Done. Each user story is assigned a Fibonacci story point weight, priority tag, assigned team member avatar, and checklist verification counter to ensure complete visibility across all sprint activities.</w:t>
       </w:r>
     </w:p>
     <w:p>
@@ -3135,6 +3223,94 @@
           <w:sz w:val="24"/>
         </w:rPr>
         <w:t>Weeks 7 to 8: Master test matrix execution (40 test cases), defect remediation, documentation finalization, and deployment readiness review.</w:t>
+      </w:r>
+    </w:p>
+    <w:p>
+      <w:pPr>
+        <w:spacing w:before="160" w:after="80" w:line="480" w:lineRule="auto"/>
+        <w:jc w:val="center"/>
+      </w:pPr>
+      <w:r>
+        <w:drawing>
+          <wp:inline xmlns:a="http://schemas.openxmlformats.org/drawingml/2006/main" xmlns:pic="http://schemas.openxmlformats.org/drawingml/2006/picture">
+            <wp:extent cx="5669280" cy="2406385"/>
+            <wp:docPr id="6" name="Picture 6"/>
+            <wp:cNvGraphicFramePr>
+              <a:graphicFrameLocks noChangeAspect="1"/>
+            </wp:cNvGraphicFramePr>
+            <a:graphic>
+              <a:graphicData uri="http://schemas.openxmlformats.org/drawingml/2006/picture">
+                <pic:pic>
+                  <pic:nvPicPr>
+                    <pic:cNvPr id="0" name="gantt_chart.png"/>
+                    <pic:cNvPicPr/>
+                  </pic:nvPicPr>
+                  <pic:blipFill>
+                    <a:blip r:embed="rId14"/>
+                    <a:stretch>
+                      <a:fillRect/>
+                    </a:stretch>
+                  </pic:blipFill>
+                  <pic:spPr>
+                    <a:xfrm>
+                      <a:off x="0" y="0"/>
+                      <a:ext cx="5669280" cy="2406385"/>
+                    </a:xfrm>
+                    <a:prstGeom prst="rect"/>
+                  </pic:spPr>
+                </pic:pic>
+              </a:graphicData>
+            </a:graphic>
+          </wp:inline>
+        </w:drawing>
+      </w:r>
+    </w:p>
+    <w:p>
+      <w:pPr>
+        <w:spacing w:before="80" w:after="40" w:line="480" w:lineRule="auto"/>
+        <w:ind w:firstLine="0"/>
+      </w:pPr>
+      <w:r>
+        <w:rPr>
+          <w:rFonts w:ascii="Times New Roman" w:hAnsi="Times New Roman"/>
+          <w:b/>
+          <w:i w:val="0"/>
+          <w:color w:val="000000"/>
+          <w:sz w:val="24"/>
+        </w:rPr>
+        <w:t>Figure 6</w:t>
+      </w:r>
+    </w:p>
+    <w:p>
+      <w:pPr>
+        <w:spacing w:before="0" w:after="120" w:line="480" w:lineRule="auto"/>
+        <w:ind w:firstLine="0"/>
+      </w:pPr>
+      <w:r>
+        <w:rPr>
+          <w:rFonts w:ascii="Times New Roman" w:hAnsi="Times New Roman"/>
+          <w:b w:val="0"/>
+          <w:i/>
+          <w:color w:val="000000"/>
+          <w:sz w:val="24"/>
+        </w:rPr>
+        <w:t>Eight-Week Agile Delivery Roadmap and Sprint Milestone Gantt Chart</w:t>
+      </w:r>
+    </w:p>
+    <w:p>
+      <w:pPr>
+        <w:spacing w:before="40" w:after="160" w:line="480" w:lineRule="auto"/>
+        <w:ind w:firstLine="720"/>
+      </w:pPr>
+      <w:r>
+        <w:rPr>
+          <w:rFonts w:ascii="Times New Roman" w:hAnsi="Times New Roman"/>
+          <w:b w:val="0"/>
+          <w:i w:val="0"/>
+          <w:color w:val="000000"/>
+          <w:sz w:val="24"/>
+        </w:rPr>
+        <w:t>Figure 6 presents our project delivery Gantt Chart spanning an eight-week lifecycle divided across four distinct sprints. The chart delineates work package durations, team lead allocations, and critical path milestones from initial requirements elicitation through final test matrix execution and documentation sign-off.</w:t>
       </w:r>
     </w:p>
     <w:p>

</xml_diff>

<commit_message>
style(apa7): Enforce 100% APA 7th compliance with header page numbers, sequential Figures 1-6 and Tables 1-4
</commit_message>
<xml_diff>
--- a/Final_Project_Report.docx
+++ b/Final_Project_Report.docx
@@ -281,8 +281,9 @@
     </w:p>
     <w:p>
       <w:pPr>
-        <w:spacing w:before="160" w:after="0" w:line="480" w:lineRule="auto"/>
+        <w:spacing w:before="200" w:after="0" w:line="480" w:lineRule="auto"/>
         <w:ind w:firstLine="0"/>
+        <w:jc w:val="left"/>
       </w:pPr>
       <w:r>
         <w:rPr>
@@ -297,8 +298,9 @@
     </w:p>
     <w:p>
       <w:pPr>
-        <w:spacing w:before="0" w:after="80" w:line="480" w:lineRule="auto"/>
+        <w:spacing w:before="0" w:after="120" w:line="480" w:lineRule="auto"/>
         <w:ind w:firstLine="0"/>
+        <w:jc w:val="left"/>
       </w:pPr>
       <w:r>
         <w:rPr>
@@ -638,9 +640,522 @@
           <w:color w:val="000000"/>
           <w:sz w:val="24"/>
         </w:rPr>
-        <w:t>Requirements engineering establishes the functional scope and operational constraints required for successful system delivery (Pressman &amp; Maxim, 2020). Our team identified three primary operational stakeholder groups: Warehouse Clerks (operational staff handling item scanning, shipment intake, and physical dispatches), Inventory Managers (supervisors tracking stock levels, safety thresholds, and vendor purchase orders), and Warehouse Auditors (compliance officers verifying transaction ledgers).</w:t>
+        <w:t>Requirements engineering establishes the functional scope and operational constraints required for successful system delivery (Pressman &amp; Maxim, 2020). Our team identified three primary operational stakeholder groups: Warehouse Clerks (operational staff handling item scanning, shipment intake, and physical dispatches), Inventory Managers (supervisors tracking stock levels, safety thresholds, and vendor purchase orders), and Warehouse Auditors (compliance officers verifying transaction ledgers). Table 2 summarizes stakeholder engagement across the project lifecycle.</w:t>
       </w:r>
     </w:p>
+    <w:p>
+      <w:pPr>
+        <w:spacing w:before="200" w:after="0" w:line="480" w:lineRule="auto"/>
+        <w:ind w:firstLine="0"/>
+        <w:jc w:val="left"/>
+      </w:pPr>
+      <w:r>
+        <w:rPr>
+          <w:rFonts w:ascii="Times New Roman" w:hAnsi="Times New Roman"/>
+          <w:b/>
+          <w:i w:val="0"/>
+          <w:color w:val="000000"/>
+          <w:sz w:val="24"/>
+        </w:rPr>
+        <w:t>Table 2</w:t>
+      </w:r>
+    </w:p>
+    <w:p>
+      <w:pPr>
+        <w:spacing w:before="0" w:after="120" w:line="480" w:lineRule="auto"/>
+        <w:ind w:firstLine="0"/>
+        <w:jc w:val="left"/>
+      </w:pPr>
+      <w:r>
+        <w:rPr>
+          <w:rFonts w:ascii="Times New Roman" w:hAnsi="Times New Roman"/>
+          <w:b w:val="0"/>
+          <w:i/>
+          <w:color w:val="000000"/>
+          <w:sz w:val="24"/>
+        </w:rPr>
+        <w:t>Stakeholder Analysis and Organizational Engagement Matrix</w:t>
+      </w:r>
+    </w:p>
+    <w:tbl>
+      <w:tblPr>
+        <w:tblW w:type="auto" w:w="0"/>
+        <w:jc w:val="center"/>
+        <w:tblLook w:firstColumn="1" w:firstRow="1" w:lastColumn="0" w:lastRow="0" w:noHBand="0" w:noVBand="1" w:val="04A0"/>
+      </w:tblPr>
+      <w:tblGrid>
+        <w:gridCol w:w="2340"/>
+        <w:gridCol w:w="2340"/>
+        <w:gridCol w:w="2340"/>
+        <w:gridCol w:w="2340"/>
+      </w:tblGrid>
+      <w:tr>
+        <w:trPr>
+          <w:cantSplit/>
+          <w:tblHeader/>
+        </w:trPr>
+        <w:tc>
+          <w:tcPr>
+            <w:tcW w:type="dxa" w:w="2160"/>
+            <w:vAlign w:val="center"/>
+          </w:tcPr>
+          <w:p>
+            <w:pPr>
+              <w:spacing w:before="40" w:after="40" w:line="276" w:lineRule="auto"/>
+              <w:ind w:firstLine="0"/>
+            </w:pPr>
+            <w:r>
+              <w:rPr>
+                <w:rFonts w:ascii="Times New Roman" w:hAnsi="Times New Roman"/>
+                <w:b/>
+                <w:i w:val="0"/>
+                <w:color w:val="000000"/>
+                <w:sz w:val="20"/>
+              </w:rPr>
+              <w:t>Stakeholder Group</w:t>
+            </w:r>
+          </w:p>
+        </w:tc>
+        <w:tc>
+          <w:tcPr>
+            <w:tcW w:type="dxa" w:w="3168"/>
+            <w:vAlign w:val="center"/>
+          </w:tcPr>
+          <w:p>
+            <w:pPr>
+              <w:spacing w:before="40" w:after="40" w:line="276" w:lineRule="auto"/>
+              <w:ind w:firstLine="0"/>
+            </w:pPr>
+            <w:r>
+              <w:rPr>
+                <w:rFonts w:ascii="Times New Roman" w:hAnsi="Times New Roman"/>
+                <w:b/>
+                <w:i w:val="0"/>
+                <w:color w:val="000000"/>
+                <w:sz w:val="20"/>
+              </w:rPr>
+              <w:t>Primary Interest / Goals</w:t>
+            </w:r>
+          </w:p>
+        </w:tc>
+        <w:tc>
+          <w:tcPr>
+            <w:tcW w:type="dxa" w:w="2592"/>
+            <w:vAlign w:val="center"/>
+          </w:tcPr>
+          <w:p>
+            <w:pPr>
+              <w:spacing w:before="40" w:after="40" w:line="276" w:lineRule="auto"/>
+              <w:ind w:firstLine="0"/>
+            </w:pPr>
+            <w:r>
+              <w:rPr>
+                <w:rFonts w:ascii="Times New Roman" w:hAnsi="Times New Roman"/>
+                <w:b/>
+                <w:i w:val="0"/>
+                <w:color w:val="000000"/>
+                <w:sz w:val="20"/>
+              </w:rPr>
+              <w:t>Influence on Project</w:t>
+            </w:r>
+          </w:p>
+        </w:tc>
+        <w:tc>
+          <w:tcPr>
+            <w:tcW w:type="dxa" w:w="2160"/>
+            <w:vAlign w:val="center"/>
+          </w:tcPr>
+          <w:p>
+            <w:pPr>
+              <w:spacing w:before="40" w:after="40" w:line="276" w:lineRule="auto"/>
+              <w:ind w:firstLine="0"/>
+            </w:pPr>
+            <w:r>
+              <w:rPr>
+                <w:rFonts w:ascii="Times New Roman" w:hAnsi="Times New Roman"/>
+                <w:b/>
+                <w:i w:val="0"/>
+                <w:color w:val="000000"/>
+                <w:sz w:val="20"/>
+              </w:rPr>
+              <w:t>Involvement Level</w:t>
+            </w:r>
+          </w:p>
+        </w:tc>
+      </w:tr>
+      <w:tr>
+        <w:trPr>
+          <w:cantSplit/>
+        </w:trPr>
+        <w:tc>
+          <w:tcPr>
+            <w:tcW w:type="dxa" w:w="2160"/>
+            <w:vAlign w:val="center"/>
+          </w:tcPr>
+          <w:p>
+            <w:pPr>
+              <w:spacing w:before="40" w:after="40" w:line="276" w:lineRule="auto"/>
+              <w:ind w:firstLine="0"/>
+            </w:pPr>
+            <w:r>
+              <w:rPr>
+                <w:rFonts w:ascii="Times New Roman" w:hAnsi="Times New Roman"/>
+                <w:b w:val="0"/>
+                <w:i w:val="0"/>
+                <w:color w:val="000000"/>
+                <w:sz w:val="20"/>
+              </w:rPr>
+              <w:t>Warehouse Clerks</w:t>
+            </w:r>
+          </w:p>
+        </w:tc>
+        <w:tc>
+          <w:tcPr>
+            <w:tcW w:type="dxa" w:w="3168"/>
+            <w:vAlign w:val="center"/>
+          </w:tcPr>
+          <w:p>
+            <w:pPr>
+              <w:spacing w:before="40" w:after="40" w:line="276" w:lineRule="auto"/>
+              <w:ind w:firstLine="0"/>
+            </w:pPr>
+            <w:r>
+              <w:rPr>
+                <w:rFonts w:ascii="Times New Roman" w:hAnsi="Times New Roman"/>
+                <w:b w:val="0"/>
+                <w:i w:val="0"/>
+                <w:color w:val="000000"/>
+                <w:sz w:val="20"/>
+              </w:rPr>
+              <w:t>Fast, accurate scanning and dispatch tools suited for active warehouse floor operations.</w:t>
+            </w:r>
+          </w:p>
+        </w:tc>
+        <w:tc>
+          <w:tcPr>
+            <w:tcW w:type="dxa" w:w="2592"/>
+            <w:vAlign w:val="center"/>
+          </w:tcPr>
+          <w:p>
+            <w:pPr>
+              <w:spacing w:before="40" w:after="40" w:line="276" w:lineRule="auto"/>
+              <w:ind w:firstLine="0"/>
+            </w:pPr>
+            <w:r>
+              <w:rPr>
+                <w:rFonts w:ascii="Times New Roman" w:hAnsi="Times New Roman"/>
+                <w:b w:val="0"/>
+                <w:i w:val="0"/>
+                <w:color w:val="000000"/>
+                <w:sz w:val="20"/>
+              </w:rPr>
+              <w:t>High: daily end users of core operational workflows.</w:t>
+            </w:r>
+          </w:p>
+        </w:tc>
+        <w:tc>
+          <w:tcPr>
+            <w:tcW w:type="dxa" w:w="2160"/>
+            <w:vAlign w:val="center"/>
+          </w:tcPr>
+          <w:p>
+            <w:pPr>
+              <w:spacing w:before="40" w:after="40" w:line="276" w:lineRule="auto"/>
+              <w:ind w:firstLine="0"/>
+            </w:pPr>
+            <w:r>
+              <w:rPr>
+                <w:rFonts w:ascii="Times New Roman" w:hAnsi="Times New Roman"/>
+                <w:b w:val="0"/>
+                <w:i w:val="0"/>
+                <w:color w:val="000000"/>
+                <w:sz w:val="20"/>
+              </w:rPr>
+              <w:t>Direct: primary UI and usability feedback consumers.</w:t>
+            </w:r>
+          </w:p>
+        </w:tc>
+      </w:tr>
+      <w:tr>
+        <w:trPr>
+          <w:cantSplit/>
+        </w:trPr>
+        <w:tc>
+          <w:tcPr>
+            <w:tcW w:type="dxa" w:w="2160"/>
+            <w:vAlign w:val="center"/>
+          </w:tcPr>
+          <w:p>
+            <w:pPr>
+              <w:spacing w:before="40" w:after="40" w:line="276" w:lineRule="auto"/>
+              <w:ind w:firstLine="0"/>
+            </w:pPr>
+            <w:r>
+              <w:rPr>
+                <w:rFonts w:ascii="Times New Roman" w:hAnsi="Times New Roman"/>
+                <w:b w:val="0"/>
+                <w:i w:val="0"/>
+                <w:color w:val="000000"/>
+                <w:sz w:val="20"/>
+              </w:rPr>
+              <w:t>Inventory Managers</w:t>
+            </w:r>
+          </w:p>
+        </w:tc>
+        <w:tc>
+          <w:tcPr>
+            <w:tcW w:type="dxa" w:w="3168"/>
+            <w:vAlign w:val="center"/>
+          </w:tcPr>
+          <w:p>
+            <w:pPr>
+              <w:spacing w:before="40" w:after="40" w:line="276" w:lineRule="auto"/>
+              <w:ind w:firstLine="0"/>
+            </w:pPr>
+            <w:r>
+              <w:rPr>
+                <w:rFonts w:ascii="Times New Roman" w:hAnsi="Times New Roman"/>
+                <w:b w:val="0"/>
+                <w:i w:val="0"/>
+                <w:color w:val="000000"/>
+                <w:sz w:val="20"/>
+              </w:rPr>
+              <w:t>Real-time stock visibility and reliable automated threshold alerts for inventory control.</w:t>
+            </w:r>
+          </w:p>
+        </w:tc>
+        <w:tc>
+          <w:tcPr>
+            <w:tcW w:type="dxa" w:w="2592"/>
+            <w:vAlign w:val="center"/>
+          </w:tcPr>
+          <w:p>
+            <w:pPr>
+              <w:spacing w:before="40" w:after="40" w:line="276" w:lineRule="auto"/>
+              <w:ind w:firstLine="0"/>
+            </w:pPr>
+            <w:r>
+              <w:rPr>
+                <w:rFonts w:ascii="Times New Roman" w:hAnsi="Times New Roman"/>
+                <w:b w:val="0"/>
+                <w:i w:val="0"/>
+                <w:color w:val="000000"/>
+                <w:sz w:val="20"/>
+              </w:rPr>
+              <w:t>High: set safety thresholds and approve replenishment purchase orders.</w:t>
+            </w:r>
+          </w:p>
+        </w:tc>
+        <w:tc>
+          <w:tcPr>
+            <w:tcW w:type="dxa" w:w="2160"/>
+            <w:vAlign w:val="center"/>
+          </w:tcPr>
+          <w:p>
+            <w:pPr>
+              <w:spacing w:before="40" w:after="40" w:line="276" w:lineRule="auto"/>
+              <w:ind w:firstLine="0"/>
+            </w:pPr>
+            <w:r>
+              <w:rPr>
+                <w:rFonts w:ascii="Times New Roman" w:hAnsi="Times New Roman"/>
+                <w:b w:val="0"/>
+                <w:i w:val="0"/>
+                <w:color w:val="000000"/>
+                <w:sz w:val="20"/>
+              </w:rPr>
+              <w:t>Direct: define core business rules and approval logic.</w:t>
+            </w:r>
+          </w:p>
+        </w:tc>
+      </w:tr>
+      <w:tr>
+        <w:trPr>
+          <w:cantSplit/>
+        </w:trPr>
+        <w:tc>
+          <w:tcPr>
+            <w:tcW w:type="dxa" w:w="2160"/>
+            <w:vAlign w:val="center"/>
+          </w:tcPr>
+          <w:p>
+            <w:pPr>
+              <w:spacing w:before="40" w:after="40" w:line="276" w:lineRule="auto"/>
+              <w:ind w:firstLine="0"/>
+            </w:pPr>
+            <w:r>
+              <w:rPr>
+                <w:rFonts w:ascii="Times New Roman" w:hAnsi="Times New Roman"/>
+                <w:b w:val="0"/>
+                <w:i w:val="0"/>
+                <w:color w:val="000000"/>
+                <w:sz w:val="20"/>
+              </w:rPr>
+              <w:t>Warehouse Auditors</w:t>
+            </w:r>
+          </w:p>
+        </w:tc>
+        <w:tc>
+          <w:tcPr>
+            <w:tcW w:type="dxa" w:w="3168"/>
+            <w:vAlign w:val="center"/>
+          </w:tcPr>
+          <w:p>
+            <w:pPr>
+              <w:spacing w:before="40" w:after="40" w:line="276" w:lineRule="auto"/>
+              <w:ind w:firstLine="0"/>
+            </w:pPr>
+            <w:r>
+              <w:rPr>
+                <w:rFonts w:ascii="Times New Roman" w:hAnsi="Times New Roman"/>
+                <w:b w:val="0"/>
+                <w:i w:val="0"/>
+                <w:color w:val="000000"/>
+                <w:sz w:val="20"/>
+              </w:rPr>
+              <w:t>Tamper-proof, immutable transaction logs for audit compliance and inventory governance.</w:t>
+            </w:r>
+          </w:p>
+        </w:tc>
+        <w:tc>
+          <w:tcPr>
+            <w:tcW w:type="dxa" w:w="2592"/>
+            <w:vAlign w:val="center"/>
+          </w:tcPr>
+          <w:p>
+            <w:pPr>
+              <w:spacing w:before="40" w:after="40" w:line="276" w:lineRule="auto"/>
+              <w:ind w:firstLine="0"/>
+            </w:pPr>
+            <w:r>
+              <w:rPr>
+                <w:rFonts w:ascii="Times New Roman" w:hAnsi="Times New Roman"/>
+                <w:b w:val="0"/>
+                <w:i w:val="0"/>
+                <w:color w:val="000000"/>
+                <w:sz w:val="20"/>
+              </w:rPr>
+              <w:t>Medium: define compliance and data retention guidelines.</w:t>
+            </w:r>
+          </w:p>
+        </w:tc>
+        <w:tc>
+          <w:tcPr>
+            <w:tcW w:type="dxa" w:w="2160"/>
+            <w:vAlign w:val="center"/>
+          </w:tcPr>
+          <w:p>
+            <w:pPr>
+              <w:spacing w:before="40" w:after="40" w:line="276" w:lineRule="auto"/>
+              <w:ind w:firstLine="0"/>
+            </w:pPr>
+            <w:r>
+              <w:rPr>
+                <w:rFonts w:ascii="Times New Roman" w:hAnsi="Times New Roman"/>
+                <w:b w:val="0"/>
+                <w:i w:val="0"/>
+                <w:color w:val="000000"/>
+                <w:sz w:val="20"/>
+              </w:rPr>
+              <w:t>Periodic: review audit logs and transaction traceability.</w:t>
+            </w:r>
+          </w:p>
+        </w:tc>
+      </w:tr>
+      <w:tr>
+        <w:trPr>
+          <w:cantSplit/>
+        </w:trPr>
+        <w:tc>
+          <w:tcPr>
+            <w:tcW w:type="dxa" w:w="2160"/>
+            <w:vAlign w:val="center"/>
+          </w:tcPr>
+          <w:p>
+            <w:pPr>
+              <w:spacing w:before="40" w:after="40" w:line="276" w:lineRule="auto"/>
+              <w:ind w:firstLine="0"/>
+            </w:pPr>
+            <w:r>
+              <w:rPr>
+                <w:rFonts w:ascii="Times New Roman" w:hAnsi="Times New Roman"/>
+                <w:b w:val="0"/>
+                <w:i w:val="0"/>
+                <w:color w:val="000000"/>
+                <w:sz w:val="20"/>
+              </w:rPr>
+              <w:t>External Suppliers</w:t>
+            </w:r>
+          </w:p>
+        </w:tc>
+        <w:tc>
+          <w:tcPr>
+            <w:tcW w:type="dxa" w:w="3168"/>
+            <w:vAlign w:val="center"/>
+          </w:tcPr>
+          <w:p>
+            <w:pPr>
+              <w:spacing w:before="40" w:after="40" w:line="276" w:lineRule="auto"/>
+              <w:ind w:firstLine="0"/>
+            </w:pPr>
+            <w:r>
+              <w:rPr>
+                <w:rFonts w:ascii="Times New Roman" w:hAnsi="Times New Roman"/>
+                <w:b w:val="0"/>
+                <w:i w:val="0"/>
+                <w:color w:val="000000"/>
+                <w:sz w:val="20"/>
+              </w:rPr>
+              <w:t>Standardized electronic purchase orders and timely shipment dispatch confirmations.</w:t>
+            </w:r>
+          </w:p>
+        </w:tc>
+        <w:tc>
+          <w:tcPr>
+            <w:tcW w:type="dxa" w:w="2592"/>
+            <w:vAlign w:val="center"/>
+          </w:tcPr>
+          <w:p>
+            <w:pPr>
+              <w:spacing w:before="40" w:after="40" w:line="276" w:lineRule="auto"/>
+              <w:ind w:firstLine="0"/>
+            </w:pPr>
+            <w:r>
+              <w:rPr>
+                <w:rFonts w:ascii="Times New Roman" w:hAnsi="Times New Roman"/>
+                <w:b w:val="0"/>
+                <w:i w:val="0"/>
+                <w:color w:val="000000"/>
+                <w:sz w:val="20"/>
+              </w:rPr>
+              <w:t>Medium: external API integration endpoints and delivery schedules.</w:t>
+            </w:r>
+          </w:p>
+        </w:tc>
+        <w:tc>
+          <w:tcPr>
+            <w:tcW w:type="dxa" w:w="2160"/>
+            <w:vAlign w:val="center"/>
+          </w:tcPr>
+          <w:p>
+            <w:pPr>
+              <w:spacing w:before="40" w:after="40" w:line="276" w:lineRule="auto"/>
+              <w:ind w:firstLine="0"/>
+            </w:pPr>
+            <w:r>
+              <w:rPr>
+                <w:rFonts w:ascii="Times New Roman" w:hAnsi="Times New Roman"/>
+                <w:b w:val="0"/>
+                <w:i w:val="0"/>
+                <w:color w:val="000000"/>
+                <w:sz w:val="20"/>
+              </w:rPr>
+              <w:t>Indirect: receive purchase orders via supplier gateway.</w:t>
+            </w:r>
+          </w:p>
+        </w:tc>
+      </w:tr>
+    </w:tbl>
     <w:p>
       <w:pPr>
         <w:spacing w:before="200" w:after="80" w:line="480" w:lineRule="auto"/>
@@ -1132,8 +1647,9 @@
     </w:p>
     <w:p>
       <w:pPr>
-        <w:spacing w:before="160" w:after="0" w:line="480" w:lineRule="auto"/>
+        <w:spacing w:before="200" w:after="0" w:line="480" w:lineRule="auto"/>
         <w:ind w:firstLine="0"/>
+        <w:jc w:val="left"/>
       </w:pPr>
       <w:r>
         <w:rPr>
@@ -1143,13 +1659,14 @@
           <w:color w:val="000000"/>
           <w:sz w:val="24"/>
         </w:rPr>
-        <w:t>Table 2</w:t>
+        <w:t>Table 3</w:t>
       </w:r>
     </w:p>
     <w:p>
       <w:pPr>
-        <w:spacing w:before="0" w:after="80" w:line="480" w:lineRule="auto"/>
+        <w:spacing w:before="0" w:after="120" w:line="480" w:lineRule="auto"/>
         <w:ind w:firstLine="0"/>
+        <w:jc w:val="left"/>
       </w:pPr>
       <w:r>
         <w:rPr>
@@ -2698,18 +3215,52 @@
           <w:color w:val="000000"/>
           <w:sz w:val="24"/>
         </w:rPr>
-        <w:t>Table 2 reflects the sprint lifecycle status across our active backlog, matching the live Trello Kanban board snapshot shown in Figure 5. Sprint 1 focused on delivering foundational operational capabilities: User Authentication (WMS-01), Stock Intake (WMS-02), Barcode Scanning (WMS-03), and Stock Level Checking (WMS-04), representing 13 total Story Points. In addition, team-level documentation and architectural modeling tickets (DOC-01 and UML-01) were completed during Sprint 1. The team conducted weekly sprint reviews to evaluate deliverables against acceptance criteria.</w:t>
+        <w:t>Table 3 reflects the sprint lifecycle status across our active backlog, matching the live Trello Kanban board snapshot shown in Figure 1. Sprint 1 focused on delivering foundational operational capabilities: User Authentication (WMS-01), Stock Intake (WMS-02), Barcode Scanning (WMS-03), and Stock Level Checking (WMS-04), representing 13 total Story Points. In addition, team-level documentation and architectural modeling tickets (DOC-01 and UML-01) were completed during Sprint 1. The team conducted weekly sprint reviews to evaluate deliverables against acceptance criteria.</w:t>
       </w:r>
     </w:p>
     <w:p>
       <w:pPr>
-        <w:spacing w:before="120" w:after="40" w:line="480" w:lineRule="auto"/>
+        <w:spacing w:before="200" w:after="0" w:line="480" w:lineRule="auto"/>
+        <w:ind w:firstLine="0"/>
+        <w:jc w:val="left"/>
+      </w:pPr>
+      <w:r>
+        <w:rPr>
+          <w:rFonts w:ascii="Times New Roman" w:hAnsi="Times New Roman"/>
+          <w:b/>
+          <w:i w:val="0"/>
+          <w:color w:val="000000"/>
+          <w:sz w:val="24"/>
+        </w:rPr>
+        <w:t>Figure 1</w:t>
+      </w:r>
+    </w:p>
+    <w:p>
+      <w:pPr>
+        <w:spacing w:before="0" w:after="120" w:line="480" w:lineRule="auto"/>
+        <w:ind w:firstLine="0"/>
+        <w:jc w:val="left"/>
+      </w:pPr>
+      <w:r>
+        <w:rPr>
+          <w:rFonts w:ascii="Times New Roman" w:hAnsi="Times New Roman"/>
+          <w:b w:val="0"/>
+          <w:i/>
+          <w:color w:val="000000"/>
+          <w:sz w:val="24"/>
+        </w:rPr>
+        <w:t>Agile Trello Sprint Board with Story Point Estimates and Task Workflow</w:t>
+      </w:r>
+    </w:p>
+    <w:p>
+      <w:pPr>
+        <w:spacing w:before="80" w:after="80" w:line="480" w:lineRule="auto"/>
         <w:jc w:val="center"/>
       </w:pPr>
       <w:r>
         <w:drawing>
           <wp:inline xmlns:a="http://schemas.openxmlformats.org/drawingml/2006/main" xmlns:pic="http://schemas.openxmlformats.org/drawingml/2006/picture">
-            <wp:extent cx="5486400" cy="3071004"/>
+            <wp:extent cx="5669280" cy="3173371"/>
             <wp:docPr id="1" name="Picture 1"/>
             <wp:cNvGraphicFramePr>
               <a:graphicFrameLocks noChangeAspect="1"/>
@@ -2722,7 +3273,7 @@
                     <pic:cNvPicPr/>
                   </pic:nvPicPr>
                   <pic:blipFill>
-                    <a:blip r:embed="rId9"/>
+                    <a:blip r:embed="rId10"/>
                     <a:stretch>
                       <a:fillRect/>
                     </a:stretch>
@@ -2730,7 +3281,7 @@
                   <pic:spPr>
                     <a:xfrm>
                       <a:off x="0" y="0"/>
-                      <a:ext cx="5486400" cy="3071004"/>
+                      <a:ext cx="5669280" cy="3173371"/>
                     </a:xfrm>
                     <a:prstGeom prst="rect"/>
                   </pic:spPr>
@@ -2739,38 +3290,6 @@
             </a:graphic>
           </wp:inline>
         </w:drawing>
-      </w:r>
-    </w:p>
-    <w:p>
-      <w:pPr>
-        <w:spacing w:before="40" w:after="0" w:line="480" w:lineRule="auto"/>
-        <w:ind w:firstLine="0"/>
-      </w:pPr>
-      <w:r>
-        <w:rPr>
-          <w:rFonts w:ascii="Times New Roman" w:hAnsi="Times New Roman"/>
-          <w:b/>
-          <w:i w:val="0"/>
-          <w:color w:val="000000"/>
-          <w:sz w:val="24"/>
-        </w:rPr>
-        <w:t>Figure 5</w:t>
-      </w:r>
-    </w:p>
-    <w:p>
-      <w:pPr>
-        <w:spacing w:before="0" w:after="80" w:line="480" w:lineRule="auto"/>
-        <w:ind w:firstLine="0"/>
-      </w:pPr>
-      <w:r>
-        <w:rPr>
-          <w:rFonts w:ascii="Times New Roman" w:hAnsi="Times New Roman"/>
-          <w:b w:val="0"/>
-          <w:i/>
-          <w:color w:val="000000"/>
-          <w:sz w:val="24"/>
-        </w:rPr>
-        <w:t>Agile Trello Sprint Board with Story Point Estimates and Task Workflow</w:t>
       </w:r>
     </w:p>
     <w:p>
@@ -2786,7 +3305,7 @@
           <w:color w:val="000000"/>
           <w:sz w:val="24"/>
         </w:rPr>
-        <w:t>Figure 5 illustrates our active Trello Kanban Sprint Board for the Warehouse Stock Inventory System. The board is structured into five distinct workflow swimlanes: Product Backlog, Sprint 2 Backlog, In Progress, QA &amp; Review, and Done (Sprint 1). Each user story is assigned a Fibonacci story point weight, priority tag, assigned team member avatar, and checklist verification counter to ensure complete visibility across all sprint activities.</w:t>
+        <w:t>Figure 1 illustrates our active Trello Kanban Sprint Board for the Warehouse Stock Inventory System. The board is structured into five distinct workflow swimlanes: Product Backlog, Sprint 2 Backlog, In Progress, QA &amp; Review, and Done (Sprint 1). Each user story is assigned a Fibonacci story point weight, priority tag, assigned team member avatar, and checklist verification counter to ensure complete visibility across all sprint activities.</w:t>
       </w:r>
     </w:p>
     <w:p>
@@ -2928,13 +3447,47 @@
     </w:p>
     <w:p>
       <w:pPr>
-        <w:spacing w:before="120" w:after="40" w:line="480" w:lineRule="auto"/>
+        <w:spacing w:before="200" w:after="0" w:line="480" w:lineRule="auto"/>
+        <w:ind w:firstLine="0"/>
+        <w:jc w:val="left"/>
+      </w:pPr>
+      <w:r>
+        <w:rPr>
+          <w:rFonts w:ascii="Times New Roman" w:hAnsi="Times New Roman"/>
+          <w:b/>
+          <w:i w:val="0"/>
+          <w:color w:val="000000"/>
+          <w:sz w:val="24"/>
+        </w:rPr>
+        <w:t>Figure 2</w:t>
+      </w:r>
+    </w:p>
+    <w:p>
+      <w:pPr>
+        <w:spacing w:before="0" w:after="120" w:line="480" w:lineRule="auto"/>
+        <w:ind w:firstLine="0"/>
+        <w:jc w:val="left"/>
+      </w:pPr>
+      <w:r>
+        <w:rPr>
+          <w:rFonts w:ascii="Times New Roman" w:hAnsi="Times New Roman"/>
+          <w:b w:val="0"/>
+          <w:i/>
+          <w:color w:val="000000"/>
+          <w:sz w:val="24"/>
+        </w:rPr>
+        <w:t>Eight-Week Agile Delivery Roadmap and Sprint Milestone Gantt Chart</w:t>
+      </w:r>
+    </w:p>
+    <w:p>
+      <w:pPr>
+        <w:spacing w:before="80" w:after="80" w:line="480" w:lineRule="auto"/>
         <w:jc w:val="center"/>
       </w:pPr>
       <w:r>
         <w:drawing>
           <wp:inline xmlns:a="http://schemas.openxmlformats.org/drawingml/2006/main" xmlns:pic="http://schemas.openxmlformats.org/drawingml/2006/picture">
-            <wp:extent cx="5486400" cy="2328760"/>
+            <wp:extent cx="5669280" cy="2406385"/>
             <wp:docPr id="2" name="Picture 2"/>
             <wp:cNvGraphicFramePr>
               <a:graphicFrameLocks noChangeAspect="1"/>
@@ -2947,7 +3500,7 @@
                     <pic:cNvPicPr/>
                   </pic:nvPicPr>
                   <pic:blipFill>
-                    <a:blip r:embed="rId10"/>
+                    <a:blip r:embed="rId11"/>
                     <a:stretch>
                       <a:fillRect/>
                     </a:stretch>
@@ -2955,7 +3508,7 @@
                   <pic:spPr>
                     <a:xfrm>
                       <a:off x="0" y="0"/>
-                      <a:ext cx="5486400" cy="2328760"/>
+                      <a:ext cx="5669280" cy="2406385"/>
                     </a:xfrm>
                     <a:prstGeom prst="rect"/>
                   </pic:spPr>
@@ -2964,38 +3517,6 @@
             </a:graphic>
           </wp:inline>
         </w:drawing>
-      </w:r>
-    </w:p>
-    <w:p>
-      <w:pPr>
-        <w:spacing w:before="40" w:after="0" w:line="480" w:lineRule="auto"/>
-        <w:ind w:firstLine="0"/>
-      </w:pPr>
-      <w:r>
-        <w:rPr>
-          <w:rFonts w:ascii="Times New Roman" w:hAnsi="Times New Roman"/>
-          <w:b/>
-          <w:i w:val="0"/>
-          <w:color w:val="000000"/>
-          <w:sz w:val="24"/>
-        </w:rPr>
-        <w:t>Figure 6</w:t>
-      </w:r>
-    </w:p>
-    <w:p>
-      <w:pPr>
-        <w:spacing w:before="0" w:after="80" w:line="480" w:lineRule="auto"/>
-        <w:ind w:firstLine="0"/>
-      </w:pPr>
-      <w:r>
-        <w:rPr>
-          <w:rFonts w:ascii="Times New Roman" w:hAnsi="Times New Roman"/>
-          <w:b w:val="0"/>
-          <w:i/>
-          <w:color w:val="000000"/>
-          <w:sz w:val="24"/>
-        </w:rPr>
-        <w:t>Eight-Week Agile Delivery Roadmap and Sprint Milestone Gantt Chart</w:t>
       </w:r>
     </w:p>
     <w:p>
@@ -3011,7 +3532,7 @@
           <w:color w:val="000000"/>
           <w:sz w:val="24"/>
         </w:rPr>
-        <w:t>Figure 6 presents our project delivery Gantt Chart spanning an eight-week lifecycle divided across four distinct sprints. The chart delineates work package durations, team lead allocations, and critical path milestones from initial requirements elicitation through final test matrix execution and documentation sign-off.</w:t>
+        <w:t>Figure 2 presents our project delivery Gantt Chart spanning an eight-week lifecycle divided across four distinct sprints. The chart delineates work package durations, team lead allocations, and critical path milestones from initial requirements elicitation through final test matrix execution and documentation sign-off.</w:t>
       </w:r>
     </w:p>
     <w:p>
@@ -3077,18 +3598,52 @@
           <w:color w:val="000000"/>
           <w:sz w:val="24"/>
         </w:rPr>
-        <w:t>The Expanded Use Case Diagram (Figure 1) models system functional boundaries across three distinct actors: Warehouse Clerk (initiates authentication, intake, barcode scanning, manual adjustments, stock checks, and dispatch processing), Inventory Manager (maintains low-stock watchlists, coordinates supplier replenishment, and generates audit reports), and Supplier Gateway (receives purchase order transmissions and confirms replenishment deliveries). Generalization relationships connect Barcode Scanning and Manual Adjustments into the Update Inventory Records use case. An &lt;&lt;include&gt;&gt; dependency connects Process Outbound Stock Request to Update Inventory Records and Generate Dispatch Note, while an &lt;&lt;extend&gt;&gt; relationship connects Apply Priority Tag for urgent shipments.</w:t>
+        <w:t>The Expanded Use Case Diagram (Figure 3) models system functional boundaries across three distinct actors: Warehouse Clerk (initiates authentication, intake, barcode scanning, manual adjustments, stock checks, and dispatch processing), Inventory Manager (maintains low-stock watchlists, coordinates supplier replenishment, and generates audit reports), and Supplier Gateway (receives purchase order transmissions and confirms replenishment deliveries). Generalization relationships connect Barcode Scanning and Manual Adjustments into the Update Inventory Records use case. An &lt;&lt;include&gt;&gt; dependency connects Process Outbound Stock Request to Update Inventory Records and Generate Dispatch Note, while an &lt;&lt;extend&gt;&gt; relationship connects Apply Priority Tag for urgent shipments.</w:t>
       </w:r>
     </w:p>
     <w:p>
       <w:pPr>
-        <w:spacing w:before="120" w:after="40" w:line="480" w:lineRule="auto"/>
+        <w:spacing w:before="200" w:after="0" w:line="480" w:lineRule="auto"/>
+        <w:ind w:firstLine="0"/>
+        <w:jc w:val="left"/>
+      </w:pPr>
+      <w:r>
+        <w:rPr>
+          <w:rFonts w:ascii="Times New Roman" w:hAnsi="Times New Roman"/>
+          <w:b/>
+          <w:i w:val="0"/>
+          <w:color w:val="000000"/>
+          <w:sz w:val="24"/>
+        </w:rPr>
+        <w:t>Figure 3</w:t>
+      </w:r>
+    </w:p>
+    <w:p>
+      <w:pPr>
+        <w:spacing w:before="0" w:after="120" w:line="480" w:lineRule="auto"/>
+        <w:ind w:firstLine="0"/>
+        <w:jc w:val="left"/>
+      </w:pPr>
+      <w:r>
+        <w:rPr>
+          <w:rFonts w:ascii="Times New Roman" w:hAnsi="Times New Roman"/>
+          <w:b w:val="0"/>
+          <w:i/>
+          <w:color w:val="000000"/>
+          <w:sz w:val="24"/>
+        </w:rPr>
+        <w:t>Expanded Use Case Diagram for Warehouse Stock Inventory System</w:t>
+      </w:r>
+    </w:p>
+    <w:p>
+      <w:pPr>
+        <w:spacing w:before="80" w:after="80" w:line="480" w:lineRule="auto"/>
         <w:jc w:val="center"/>
       </w:pPr>
       <w:r>
         <w:drawing>
           <wp:inline xmlns:a="http://schemas.openxmlformats.org/drawingml/2006/main" xmlns:pic="http://schemas.openxmlformats.org/drawingml/2006/picture">
-            <wp:extent cx="5486400" cy="4315852"/>
+            <wp:extent cx="5669280" cy="4459714"/>
             <wp:docPr id="3" name="Picture 3"/>
             <wp:cNvGraphicFramePr>
               <a:graphicFrameLocks noChangeAspect="1"/>
@@ -3101,7 +3656,7 @@
                     <pic:cNvPicPr/>
                   </pic:nvPicPr>
                   <pic:blipFill>
-                    <a:blip r:embed="rId11"/>
+                    <a:blip r:embed="rId12"/>
                     <a:stretch>
                       <a:fillRect/>
                     </a:stretch>
@@ -3109,7 +3664,7 @@
                   <pic:spPr>
                     <a:xfrm>
                       <a:off x="0" y="0"/>
-                      <a:ext cx="5486400" cy="4315852"/>
+                      <a:ext cx="5669280" cy="4459714"/>
                     </a:xfrm>
                     <a:prstGeom prst="rect"/>
                   </pic:spPr>
@@ -3118,38 +3673,6 @@
             </a:graphic>
           </wp:inline>
         </w:drawing>
-      </w:r>
-    </w:p>
-    <w:p>
-      <w:pPr>
-        <w:spacing w:before="40" w:after="0" w:line="480" w:lineRule="auto"/>
-        <w:ind w:firstLine="0"/>
-      </w:pPr>
-      <w:r>
-        <w:rPr>
-          <w:rFonts w:ascii="Times New Roman" w:hAnsi="Times New Roman"/>
-          <w:b/>
-          <w:i w:val="0"/>
-          <w:color w:val="000000"/>
-          <w:sz w:val="24"/>
-        </w:rPr>
-        <w:t>Figure 1</w:t>
-      </w:r>
-    </w:p>
-    <w:p>
-      <w:pPr>
-        <w:spacing w:before="0" w:after="80" w:line="480" w:lineRule="auto"/>
-        <w:ind w:firstLine="0"/>
-      </w:pPr>
-      <w:r>
-        <w:rPr>
-          <w:rFonts w:ascii="Times New Roman" w:hAnsi="Times New Roman"/>
-          <w:b w:val="0"/>
-          <w:i/>
-          <w:color w:val="000000"/>
-          <w:sz w:val="24"/>
-        </w:rPr>
-        <w:t>Expanded Use Case Diagram for Warehouse Stock Inventory System</w:t>
       </w:r>
     </w:p>
     <w:p>
@@ -3165,7 +3688,7 @@
           <w:color w:val="000000"/>
           <w:sz w:val="24"/>
         </w:rPr>
-        <w:t>Figure 1 illustrates all functional system use cases and interactions across the Warehouse Clerk, Inventory Manager, and Supplier Gateway actors, incorporating standard &lt;&lt;include&gt;&gt; and &lt;&lt;extend&gt;&gt; UML relationships.</w:t>
+        <w:t>Figure 3 illustrates all functional system use cases and interactions across the Warehouse Clerk, Inventory Manager, and Supplier Gateway actors, incorporating standard &lt;&lt;include&gt;&gt; and &lt;&lt;extend&gt;&gt; UML relationships.</w:t>
       </w:r>
     </w:p>
     <w:p>
@@ -3198,7 +3721,7 @@
           <w:color w:val="000000"/>
           <w:sz w:val="24"/>
         </w:rPr>
-        <w:t>The Sequence Diagram (Figure 2) illustrates the synchronous message exchange across five system participants: Warehouse Clerk (actor), :LoginPage (boundary UI), :LoginController (control layer), :LoginService (domain service), and :LoginRepository (persistence layer). The interaction begins when the clerk inputs credentials via submitCredentials(username, password). The LoginPage invokes login(username, password) on the LoginController, which delegates credential evaluation to the LoginService via verifyCredentials(username, password). The LoginService queries the LoginRepository using fetchUserDetails(username), which retrieves the stored userRecord.</w:t>
+        <w:t>The Sequence Diagram (Figure 4) illustrates the synchronous message exchange across five system participants: Warehouse Clerk (actor), :LoginPage (boundary UI), :LoginController (control layer), :LoginService (domain service), and :LoginRepository (persistence layer). The interaction begins when the clerk inputs credentials via submitCredentials(username, password). The LoginPage invokes login(username, password) on the LoginController, which delegates credential evaluation to the LoginService via verifyCredentials(username, password). The LoginService queries the LoginRepository using fetchUserDetails(username), which retrieves the stored userRecord.</w:t>
       </w:r>
     </w:p>
     <w:p>
@@ -3219,13 +3742,47 @@
     </w:p>
     <w:p>
       <w:pPr>
-        <w:spacing w:before="120" w:after="40" w:line="480" w:lineRule="auto"/>
+        <w:spacing w:before="200" w:after="0" w:line="480" w:lineRule="auto"/>
+        <w:ind w:firstLine="0"/>
+        <w:jc w:val="left"/>
+      </w:pPr>
+      <w:r>
+        <w:rPr>
+          <w:rFonts w:ascii="Times New Roman" w:hAnsi="Times New Roman"/>
+          <w:b/>
+          <w:i w:val="0"/>
+          <w:color w:val="000000"/>
+          <w:sz w:val="24"/>
+        </w:rPr>
+        <w:t>Figure 4</w:t>
+      </w:r>
+    </w:p>
+    <w:p>
+      <w:pPr>
+        <w:spacing w:before="0" w:after="120" w:line="480" w:lineRule="auto"/>
+        <w:ind w:firstLine="0"/>
+        <w:jc w:val="left"/>
+      </w:pPr>
+      <w:r>
+        <w:rPr>
+          <w:rFonts w:ascii="Times New Roman" w:hAnsi="Times New Roman"/>
+          <w:b w:val="0"/>
+          <w:i/>
+          <w:color w:val="000000"/>
+          <w:sz w:val="24"/>
+        </w:rPr>
+        <w:t>Sequence Diagram for User Authentication and Session Verification</w:t>
+      </w:r>
+    </w:p>
+    <w:p>
+      <w:pPr>
+        <w:spacing w:before="80" w:after="80" w:line="480" w:lineRule="auto"/>
         <w:jc w:val="center"/>
       </w:pPr>
       <w:r>
         <w:drawing>
           <wp:inline xmlns:a="http://schemas.openxmlformats.org/drawingml/2006/main" xmlns:pic="http://schemas.openxmlformats.org/drawingml/2006/picture">
-            <wp:extent cx="5486400" cy="4647821"/>
+            <wp:extent cx="5669280" cy="4802749"/>
             <wp:docPr id="4" name="Picture 4"/>
             <wp:cNvGraphicFramePr>
               <a:graphicFrameLocks noChangeAspect="1"/>
@@ -3238,7 +3795,7 @@
                     <pic:cNvPicPr/>
                   </pic:nvPicPr>
                   <pic:blipFill>
-                    <a:blip r:embed="rId12"/>
+                    <a:blip r:embed="rId13"/>
                     <a:stretch>
                       <a:fillRect/>
                     </a:stretch>
@@ -3246,7 +3803,7 @@
                   <pic:spPr>
                     <a:xfrm>
                       <a:off x="0" y="0"/>
-                      <a:ext cx="5486400" cy="4647821"/>
+                      <a:ext cx="5669280" cy="4802749"/>
                     </a:xfrm>
                     <a:prstGeom prst="rect"/>
                   </pic:spPr>
@@ -3255,38 +3812,6 @@
             </a:graphic>
           </wp:inline>
         </w:drawing>
-      </w:r>
-    </w:p>
-    <w:p>
-      <w:pPr>
-        <w:spacing w:before="40" w:after="0" w:line="480" w:lineRule="auto"/>
-        <w:ind w:firstLine="0"/>
-      </w:pPr>
-      <w:r>
-        <w:rPr>
-          <w:rFonts w:ascii="Times New Roman" w:hAnsi="Times New Roman"/>
-          <w:b/>
-          <w:i w:val="0"/>
-          <w:color w:val="000000"/>
-          <w:sz w:val="24"/>
-        </w:rPr>
-        <w:t>Figure 2</w:t>
-      </w:r>
-    </w:p>
-    <w:p>
-      <w:pPr>
-        <w:spacing w:before="0" w:after="80" w:line="480" w:lineRule="auto"/>
-        <w:ind w:firstLine="0"/>
-      </w:pPr>
-      <w:r>
-        <w:rPr>
-          <w:rFonts w:ascii="Times New Roman" w:hAnsi="Times New Roman"/>
-          <w:b w:val="0"/>
-          <w:i/>
-          <w:color w:val="000000"/>
-          <w:sz w:val="24"/>
-        </w:rPr>
-        <w:t>Sequence Diagram for User Authentication and Session Verification</w:t>
       </w:r>
     </w:p>
     <w:p>
@@ -3302,7 +3827,7 @@
           <w:color w:val="000000"/>
           <w:sz w:val="24"/>
         </w:rPr>
-        <w:t>Figure 2 models the sequence of method calls across presentation, controller, service, and persistence layers during user login, detailing the conditional alt execution paths for valid and invalid credentials.</w:t>
+        <w:t>Figure 4 models the sequence of method calls across presentation, controller, service, and persistence layers during user login, detailing the conditional alt execution paths for valid and invalid credentials.</w:t>
       </w:r>
     </w:p>
     <w:p>
@@ -3335,7 +3860,7 @@
           <w:color w:val="000000"/>
           <w:sz w:val="24"/>
         </w:rPr>
-        <w:t>The Activity Diagram (Figure 3) models the end-to-end workflow of processing stock requests across three dedicated swimlanes: Warehouse Clerk, Inventory System, and Supplier Gateway. The process originates at the initial node in the Warehouse Clerk swimlane, where the clerk reviews the stock request and triggers Initiate Stock Processing. Control transitions to the Inventory System swimlane to execute Check Stock Levels. A decision diamond evaluates Is Available?: if stock is insufficient ([No]), the request terminates at an activity stop node; if stock is available ([Yes]), control returns to the clerk to Provide Dispatch Details.</w:t>
+        <w:t>The Activity Diagram (Figure 5) models the end-to-end workflow of processing stock requests across three dedicated swimlanes: Warehouse Clerk, Inventory System, and Supplier Gateway. The process originates at the initial node in the Warehouse Clerk swimlane, where the clerk reviews the stock request and triggers Initiate Stock Processing. Control transitions to the Inventory System swimlane to execute Check Stock Levels. A decision diamond evaluates Is Available?: if stock is insufficient ([No]), the request terminates at an activity stop node; if stock is available ([Yes]), control returns to the clerk to Provide Dispatch Details.</w:t>
       </w:r>
     </w:p>
     <w:p>
@@ -3356,13 +3881,47 @@
     </w:p>
     <w:p>
       <w:pPr>
-        <w:spacing w:before="120" w:after="40" w:line="480" w:lineRule="auto"/>
+        <w:spacing w:before="200" w:after="0" w:line="480" w:lineRule="auto"/>
+        <w:ind w:firstLine="0"/>
+        <w:jc w:val="left"/>
+      </w:pPr>
+      <w:r>
+        <w:rPr>
+          <w:rFonts w:ascii="Times New Roman" w:hAnsi="Times New Roman"/>
+          <w:b/>
+          <w:i w:val="0"/>
+          <w:color w:val="000000"/>
+          <w:sz w:val="24"/>
+        </w:rPr>
+        <w:t>Figure 5</w:t>
+      </w:r>
+    </w:p>
+    <w:p>
+      <w:pPr>
+        <w:spacing w:before="0" w:after="120" w:line="480" w:lineRule="auto"/>
+        <w:ind w:firstLine="0"/>
+        <w:jc w:val="left"/>
+      </w:pPr>
+      <w:r>
+        <w:rPr>
+          <w:rFonts w:ascii="Times New Roman" w:hAnsi="Times New Roman"/>
+          <w:b w:val="0"/>
+          <w:i/>
+          <w:color w:val="000000"/>
+          <w:sz w:val="24"/>
+        </w:rPr>
+        <w:t>Activity Diagram for End-to-End Stock Request Processing Across 3 Swimlanes</w:t>
+      </w:r>
+    </w:p>
+    <w:p>
+      <w:pPr>
+        <w:spacing w:before="80" w:after="80" w:line="480" w:lineRule="auto"/>
         <w:jc w:val="center"/>
       </w:pPr>
       <w:r>
         <w:drawing>
           <wp:inline xmlns:a="http://schemas.openxmlformats.org/drawingml/2006/main" xmlns:pic="http://schemas.openxmlformats.org/drawingml/2006/picture">
-            <wp:extent cx="5486400" cy="6263785"/>
+            <wp:extent cx="5669280" cy="6472578"/>
             <wp:docPr id="5" name="Picture 5"/>
             <wp:cNvGraphicFramePr>
               <a:graphicFrameLocks noChangeAspect="1"/>
@@ -3375,7 +3934,7 @@
                     <pic:cNvPicPr/>
                   </pic:nvPicPr>
                   <pic:blipFill>
-                    <a:blip r:embed="rId13"/>
+                    <a:blip r:embed="rId14"/>
                     <a:stretch>
                       <a:fillRect/>
                     </a:stretch>
@@ -3383,7 +3942,7 @@
                   <pic:spPr>
                     <a:xfrm>
                       <a:off x="0" y="0"/>
-                      <a:ext cx="5486400" cy="6263785"/>
+                      <a:ext cx="5669280" cy="6472578"/>
                     </a:xfrm>
                     <a:prstGeom prst="rect"/>
                   </pic:spPr>
@@ -3392,38 +3951,6 @@
             </a:graphic>
           </wp:inline>
         </w:drawing>
-      </w:r>
-    </w:p>
-    <w:p>
-      <w:pPr>
-        <w:spacing w:before="40" w:after="0" w:line="480" w:lineRule="auto"/>
-        <w:ind w:firstLine="0"/>
-      </w:pPr>
-      <w:r>
-        <w:rPr>
-          <w:rFonts w:ascii="Times New Roman" w:hAnsi="Times New Roman"/>
-          <w:b/>
-          <w:i w:val="0"/>
-          <w:color w:val="000000"/>
-          <w:sz w:val="24"/>
-        </w:rPr>
-        <w:t>Figure 3</w:t>
-      </w:r>
-    </w:p>
-    <w:p>
-      <w:pPr>
-        <w:spacing w:before="0" w:after="80" w:line="480" w:lineRule="auto"/>
-        <w:ind w:firstLine="0"/>
-      </w:pPr>
-      <w:r>
-        <w:rPr>
-          <w:rFonts w:ascii="Times New Roman" w:hAnsi="Times New Roman"/>
-          <w:b w:val="0"/>
-          <w:i/>
-          <w:color w:val="000000"/>
-          <w:sz w:val="24"/>
-        </w:rPr>
-        <w:t>Activity Diagram for End-to-End Stock Request Processing Across 3 Swimlanes</w:t>
       </w:r>
     </w:p>
     <w:p>
@@ -3439,7 +3966,7 @@
           <w:color w:val="000000"/>
           <w:sz w:val="24"/>
         </w:rPr>
-        <w:t>Figure 3 illustrates the operational workflow of stock request fulfillment across three swimlanes, highlighting decision guards, concurrent fork/join branches, and completion paths.</w:t>
+        <w:t>Figure 5 illustrates the operational workflow of stock request fulfillment across three swimlanes, highlighting decision guards, concurrent fork/join branches, and completion paths.</w:t>
       </w:r>
     </w:p>
     <w:p>
@@ -3472,7 +3999,7 @@
           <w:color w:val="000000"/>
           <w:sz w:val="24"/>
         </w:rPr>
-        <w:t>The Class Diagram (Figure 4) defines the core structural entities, domain attributes, and association multiplicities within the Warehouse Stock Inventory System. The model consists of eight domain classes: WarehouseClerk (storing clerkID, name, email, phone, and shift), WarehouseStaff (storing staffID, name, role, and phone), StockRequest (storing requestID, clerkID, staffID, requestDate, and status), RequestItem (storing requestItemID, requestID, productID, quantity, and unitCost), Product (storing productID, name, category, unitPrice, and stockQty), InventoryItem (storing itemID, productID, quantity, reorderLevel, and minStockLevel), DispatchNote (storing noteID, requestID, issueDate, totalAmount, and status), and StockTransaction (storing transactionID, noteID, amount, type, date, and status).</w:t>
+        <w:t>The Class Diagram (Figure 6) defines the core structural entities, domain attributes, and association multiplicities within the Warehouse Stock Inventory System. The model consists of eight domain classes: WarehouseClerk (storing clerkID, name, email, phone, and shift), WarehouseStaff (storing staffID, name, role, and phone), StockRequest (storing requestID, clerkID, staffID, requestDate, and status), RequestItem (storing requestItemID, requestID, productID, quantity, and unitCost), Product (storing productID, name, category, unitPrice, and stockQty), InventoryItem (storing itemID, productID, quantity, reorderLevel, and minStockLevel), DispatchNote (storing noteID, requestID, issueDate, totalAmount, and status), and StockTransaction (storing transactionID, noteID, amount, type, date, and status).</w:t>
       </w:r>
     </w:p>
     <w:p>
@@ -3493,13 +4020,47 @@
     </w:p>
     <w:p>
       <w:pPr>
-        <w:spacing w:before="120" w:after="40" w:line="480" w:lineRule="auto"/>
+        <w:spacing w:before="200" w:after="0" w:line="480" w:lineRule="auto"/>
+        <w:ind w:firstLine="0"/>
+        <w:jc w:val="left"/>
+      </w:pPr>
+      <w:r>
+        <w:rPr>
+          <w:rFonts w:ascii="Times New Roman" w:hAnsi="Times New Roman"/>
+          <w:b/>
+          <w:i w:val="0"/>
+          <w:color w:val="000000"/>
+          <w:sz w:val="24"/>
+        </w:rPr>
+        <w:t>Figure 6</w:t>
+      </w:r>
+    </w:p>
+    <w:p>
+      <w:pPr>
+        <w:spacing w:before="0" w:after="120" w:line="480" w:lineRule="auto"/>
+        <w:ind w:firstLine="0"/>
+        <w:jc w:val="left"/>
+      </w:pPr>
+      <w:r>
+        <w:rPr>
+          <w:rFonts w:ascii="Times New Roman" w:hAnsi="Times New Roman"/>
+          <w:b w:val="0"/>
+          <w:i/>
+          <w:color w:val="000000"/>
+          <w:sz w:val="24"/>
+        </w:rPr>
+        <w:t>Multi-Tier Class Diagram for Domain Entities and Multiplicity Relationships</w:t>
+      </w:r>
+    </w:p>
+    <w:p>
+      <w:pPr>
+        <w:spacing w:before="80" w:after="80" w:line="480" w:lineRule="auto"/>
         <w:jc w:val="center"/>
       </w:pPr>
       <w:r>
         <w:drawing>
           <wp:inline xmlns:a="http://schemas.openxmlformats.org/drawingml/2006/main" xmlns:pic="http://schemas.openxmlformats.org/drawingml/2006/picture">
-            <wp:extent cx="5486400" cy="5875093"/>
+            <wp:extent cx="5669280" cy="6070929"/>
             <wp:docPr id="6" name="Picture 6"/>
             <wp:cNvGraphicFramePr>
               <a:graphicFrameLocks noChangeAspect="1"/>
@@ -3512,7 +4073,7 @@
                     <pic:cNvPicPr/>
                   </pic:nvPicPr>
                   <pic:blipFill>
-                    <a:blip r:embed="rId14"/>
+                    <a:blip r:embed="rId15"/>
                     <a:stretch>
                       <a:fillRect/>
                     </a:stretch>
@@ -3520,7 +4081,7 @@
                   <pic:spPr>
                     <a:xfrm>
                       <a:off x="0" y="0"/>
-                      <a:ext cx="5486400" cy="5875093"/>
+                      <a:ext cx="5669280" cy="6070929"/>
                     </a:xfrm>
                     <a:prstGeom prst="rect"/>
                   </pic:spPr>
@@ -3529,38 +4090,6 @@
             </a:graphic>
           </wp:inline>
         </w:drawing>
-      </w:r>
-    </w:p>
-    <w:p>
-      <w:pPr>
-        <w:spacing w:before="40" w:after="0" w:line="480" w:lineRule="auto"/>
-        <w:ind w:firstLine="0"/>
-      </w:pPr>
-      <w:r>
-        <w:rPr>
-          <w:rFonts w:ascii="Times New Roman" w:hAnsi="Times New Roman"/>
-          <w:b/>
-          <w:i w:val="0"/>
-          <w:color w:val="000000"/>
-          <w:sz w:val="24"/>
-        </w:rPr>
-        <w:t>Figure 4</w:t>
-      </w:r>
-    </w:p>
-    <w:p>
-      <w:pPr>
-        <w:spacing w:before="0" w:after="80" w:line="480" w:lineRule="auto"/>
-        <w:ind w:firstLine="0"/>
-      </w:pPr>
-      <w:r>
-        <w:rPr>
-          <w:rFonts w:ascii="Times New Roman" w:hAnsi="Times New Roman"/>
-          <w:b w:val="0"/>
-          <w:i/>
-          <w:color w:val="000000"/>
-          <w:sz w:val="24"/>
-        </w:rPr>
-        <w:t>Multi-Tier Class Diagram for Domain Entities and Multiplicity Relationships</w:t>
       </w:r>
     </w:p>
     <w:p>
@@ -3576,7 +4105,7 @@
           <w:color w:val="000000"/>
           <w:sz w:val="24"/>
         </w:rPr>
-        <w:t>Figure 4 defines the structural domain model, detailing attribute specifications, visibility markers, and cardinality relationships across all eight system entity classes.</w:t>
+        <w:t>Figure 6 defines the structural domain model, detailing attribute specifications, visibility markers, and cardinality relationships across all eight system entity classes.</w:t>
       </w:r>
     </w:p>
     <w:p>
@@ -3609,13 +4138,14 @@
           <w:color w:val="000000"/>
           <w:sz w:val="24"/>
         </w:rPr>
-        <w:t>To verify system stability, our team designed and executed a master testing matrix of 40 test cases mapped across our 10 User Stories (4 test cases per story: 2 positive standard validation tests and 2 targeted negative or edge-case tests). Testing systematically evaluated four verification levels across each user story: Unit Testing, Integration Testing, System Testing, and User Acceptance Testing (UAT) (Myers et al., 2012; Jorgensen &amp; DeVries, 2021). Table 3 provides an itemized summary of test execution results across all 10 user stories.</w:t>
+        <w:t>To verify system stability, our team designed and executed a master testing matrix of 40 test cases mapped across our 10 User Stories (4 test cases per story: 2 positive standard validation tests and 2 targeted negative or edge-case tests). Testing systematically evaluated four verification levels across each user story: Unit Testing, Integration Testing, System Testing, and User Acceptance Testing (UAT) (Myers et al., 2012; Jorgensen &amp; DeVries, 2021). Table 4 provides an itemized summary of test execution results across all 10 user stories.</w:t>
       </w:r>
     </w:p>
     <w:p>
       <w:pPr>
-        <w:spacing w:before="160" w:after="0" w:line="480" w:lineRule="auto"/>
+        <w:spacing w:before="200" w:after="0" w:line="480" w:lineRule="auto"/>
         <w:ind w:firstLine="0"/>
+        <w:jc w:val="left"/>
       </w:pPr>
       <w:r>
         <w:rPr>
@@ -3625,13 +4155,14 @@
           <w:color w:val="000000"/>
           <w:sz w:val="24"/>
         </w:rPr>
-        <w:t>Table 3</w:t>
+        <w:t>Table 4</w:t>
       </w:r>
     </w:p>
     <w:p>
       <w:pPr>
-        <w:spacing w:before="0" w:after="80" w:line="480" w:lineRule="auto"/>
+        <w:spacing w:before="0" w:after="120" w:line="480" w:lineRule="auto"/>
         <w:ind w:firstLine="0"/>
+        <w:jc w:val="left"/>
       </w:pPr>
       <w:r>
         <w:rPr>
@@ -5472,6 +6003,7 @@
       </w:r>
     </w:p>
     <w:sectPr>
+      <w:headerReference w:type="default" r:id="rId9"/>
       <w:pgSz w:w="12240" w:h="15840"/>
       <w:pgMar w:top="1440" w:right="1440" w:bottom="1440" w:left="1440" w:header="720" w:footer="720" w:gutter="0"/>
       <w:cols w:space="720"/>
@@ -5479,6 +6011,20 @@
     </w:sectPr>
   </w:body>
 </w:document>
+</file>
+
+<file path=word/header1.xml><?xml version="1.0" encoding="utf-8"?>
+<w:hdr xmlns:m="http://schemas.openxmlformats.org/officeDocument/2006/math" xmlns:mc="http://schemas.openxmlformats.org/markup-compatibility/2006" xmlns:mo="http://schemas.microsoft.com/office/mac/office/2008/main" xmlns:mv="urn:schemas-microsoft-com:mac:vml" xmlns:o="urn:schemas-microsoft-com:office:office" xmlns:r="http://schemas.openxmlformats.org/officeDocument/2006/relationships" xmlns:v="urn:schemas-microsoft-com:vml" xmlns:w10="urn:schemas-microsoft-com:office:word" xmlns:w14="http://schemas.microsoft.com/office/word/2010/wordml" xmlns:w="http://schemas.openxmlformats.org/wordprocessingml/2006/main" xmlns:wne="http://schemas.microsoft.com/office/word/2006/wordml" xmlns:wp14="http://schemas.microsoft.com/office/word/2010/wordprocessingDrawing" xmlns:wp="http://schemas.openxmlformats.org/drawingml/2006/wordprocessingDrawing" xmlns:wpc="http://schemas.microsoft.com/office/word/2010/wordprocessingCanvas" xmlns:wpg="http://schemas.microsoft.com/office/word/2010/wordprocessingGroup" xmlns:wpi="http://schemas.microsoft.com/office/word/2010/wordprocessingInk" xmlns:wps="http://schemas.microsoft.com/office/word/2010/wordprocessingShape" mc:Ignorable="w14 wp14">
+  <w:p>
+    <w:pPr>
+      <w:pStyle w:val="Header"/>
+      <w:spacing w:before="0" w:after="0" w:line="240" w:lineRule="auto"/>
+      <w:jc w:val="right"/>
+    </w:pPr>
+    <w:r/>
+    <w:fldSimple w:instr="PAGE"/>
+  </w:p>
+</w:hdr>
 </file>
 
 <file path=word/numbering.xml><?xml version="1.0" encoding="utf-8"?>

</xml_diff>

<commit_message>
docs: Update final project report with Excel sprint planning model and Gantt methodology
</commit_message>
<xml_diff>
--- a/Final_Project_Report.docx
+++ b/Final_Project_Report.docx
@@ -3322,7 +3322,23 @@
           <w:color w:val="000000"/>
           <w:sz w:val="24"/>
         </w:rPr>
-        <w:t>Sprint Timeline and Gantt Chart</w:t>
+        <w:t>Sprint Timeline, Work Breakdown, and Gantt Chart</w:t>
+      </w:r>
+    </w:p>
+    <w:p>
+      <w:pPr>
+        <w:spacing w:before="0" w:after="80" w:line="480" w:lineRule="auto"/>
+        <w:ind w:firstLine="720"/>
+      </w:pPr>
+      <w:r>
+        <w:rPr>
+          <w:rFonts w:ascii="Times New Roman" w:hAnsi="Times New Roman"/>
+          <w:b w:val="0"/>
+          <w:i w:val="0"/>
+          <w:color w:val="000000"/>
+          <w:sz w:val="24"/>
+        </w:rPr>
+        <w:t>In addition to visual board tracking, our engineering team constructed a formal Agile sprint planning model (Planning_WMS.xlsx) to calculate work package durations, team lead allocations, and critical path milestones across the eight-week development lifecycle. Each sprint activity is governed by discrete start dates, expected working durations, completion dates, and a calculated refined calendar duration using the formula: Refined Duration = (End Date - Start Date) + 1.</w:t>
       </w:r>
     </w:p>
     <w:p>
@@ -3532,7 +3548,7 @@
           <w:color w:val="000000"/>
           <w:sz w:val="24"/>
         </w:rPr>
-        <w:t>Figure 2 presents our project delivery Gantt Chart spanning an eight-week lifecycle divided across four distinct sprints. The chart delineates work package durations, team lead allocations, and critical path milestones from initial requirements elicitation through final test matrix execution and documentation sign-off.</w:t>
+        <w:t>Figure 2 presents our project delivery Gantt Chart spanning an eight-week lifecycle divided across four distinct sprints. The chart delineates work package durations, team lead allocations, and critical path milestones derived from our Planning_WMS.xlsx sprint schedule model.</w:t>
       </w:r>
     </w:p>
     <w:p>
@@ -5647,7 +5663,7 @@
           <w:color w:val="000000"/>
           <w:sz w:val="24"/>
         </w:rPr>
-        <w:t>Contains Trello sprint board exports, story point estimation sheets, and meeting minutes.</w:t>
+        <w:t>Contains Trello sprint board exports, story point estimation sheets, sprint scheduling workbooks (Planning_WMS.xlsx), and meeting minutes.</w:t>
       </w:r>
     </w:p>
     <w:p>

</xml_diff>

<commit_message>
feat(gantt): Update Gantt chart with individual WMS stories and refine Planning_WMS.xlsx
</commit_message>
<xml_diff>
--- a/Final_Project_Report.docx
+++ b/Final_Project_Report.docx
@@ -3503,7 +3503,7 @@
       <w:r>
         <w:drawing>
           <wp:inline xmlns:a="http://schemas.openxmlformats.org/drawingml/2006/main" xmlns:pic="http://schemas.openxmlformats.org/drawingml/2006/picture">
-            <wp:extent cx="5669280" cy="2406385"/>
+            <wp:extent cx="5669280" cy="3787966"/>
             <wp:docPr id="2" name="Picture 2"/>
             <wp:cNvGraphicFramePr>
               <a:graphicFrameLocks noChangeAspect="1"/>
@@ -3524,7 +3524,7 @@
                   <pic:spPr>
                     <a:xfrm>
                       <a:off x="0" y="0"/>
-                      <a:ext cx="5669280" cy="2406385"/>
+                      <a:ext cx="5669280" cy="3787966"/>
                     </a:xfrm>
                     <a:prstGeom prst="rect"/>
                   </pic:spPr>

</xml_diff>

<commit_message>
fix(final-audit): Synchronize exact 8-week schedule, clean UML models, and APA 7th report
</commit_message>
<xml_diff>
--- a/Final_Project_Report.docx
+++ b/Final_Project_Report.docx
@@ -243,7 +243,7 @@
           <w:color w:val="000000"/>
           <w:sz w:val="24"/>
         </w:rPr>
-        <w:t>This project simulates a real-world enterprise software development lifecycle without raw source code implementation, using Trello for visual Agile sprint coordination and GitHub for document version control and team collaboration. The project scope covers requirement elicitation, stakeholder analysis, domain modeling with Unified Modeling Language (UML) diagrams, test-driven validation using a master test matrix, and Agile sprint planning.</w:t>
+        <w:t>In accordance with the CSE 220 course syllabus, this project simulates a real-world enterprise software development lifecycle without raw source code implementation. The project uses Trello for visual Agile sprint coordination, Excel for detailed scheduling and test matrices, and GitHub for document version control and team collaboration. The project scope covers requirement elicitation, stakeholder analysis, domain modeling with Unified Modeling Language (UML) diagrams, simulated design-phase test validation across 40 test cases, and Agile sprint scheduling.</w:t>
       </w:r>
     </w:p>
     <w:p>
@@ -281,7 +281,7 @@
     </w:p>
     <w:p>
       <w:pPr>
-        <w:spacing w:before="200" w:after="0" w:line="480" w:lineRule="auto"/>
+        <w:spacing w:before="160" w:after="0" w:line="480" w:lineRule="auto"/>
         <w:ind w:firstLine="0"/>
         <w:jc w:val="left"/>
       </w:pPr>
@@ -298,7 +298,7 @@
     </w:p>
     <w:p>
       <w:pPr>
-        <w:spacing w:before="0" w:after="120" w:line="480" w:lineRule="auto"/>
+        <w:spacing w:before="0" w:after="80" w:line="480" w:lineRule="auto"/>
         <w:ind w:firstLine="0"/>
         <w:jc w:val="left"/>
       </w:pPr>
@@ -645,7 +645,7 @@
     </w:p>
     <w:p>
       <w:pPr>
-        <w:spacing w:before="200" w:after="0" w:line="480" w:lineRule="auto"/>
+        <w:spacing w:before="160" w:after="0" w:line="480" w:lineRule="auto"/>
         <w:ind w:firstLine="0"/>
         <w:jc w:val="left"/>
       </w:pPr>
@@ -662,7 +662,7 @@
     </w:p>
     <w:p>
       <w:pPr>
-        <w:spacing w:before="0" w:after="120" w:line="480" w:lineRule="auto"/>
+        <w:spacing w:before="0" w:after="80" w:line="480" w:lineRule="auto"/>
         <w:ind w:firstLine="0"/>
         <w:jc w:val="left"/>
       </w:pPr>
@@ -1557,7 +1557,7 @@
           <w:color w:val="000000"/>
           <w:sz w:val="24"/>
         </w:rPr>
-        <w:t>All user credentials shall be encrypted with Argon2/bcrypt, and API communications shall use TLS 1.3 encryption.</w:t>
+        <w:t>User passwords shall be securely hashed using Argon2id or bcrypt with unique cryptographic salts, and API communications shall use TLS 1.3 encryption.</w:t>
       </w:r>
     </w:p>
     <w:p>
@@ -1647,7 +1647,7 @@
     </w:p>
     <w:p>
       <w:pPr>
-        <w:spacing w:before="200" w:after="0" w:line="480" w:lineRule="auto"/>
+        <w:spacing w:before="160" w:after="0" w:line="480" w:lineRule="auto"/>
         <w:ind w:firstLine="0"/>
         <w:jc w:val="left"/>
       </w:pPr>
@@ -1664,7 +1664,7 @@
     </w:p>
     <w:p>
       <w:pPr>
-        <w:spacing w:before="0" w:after="120" w:line="480" w:lineRule="auto"/>
+        <w:spacing w:before="0" w:after="80" w:line="480" w:lineRule="auto"/>
         <w:ind w:firstLine="0"/>
         <w:jc w:val="left"/>
       </w:pPr>
@@ -3220,7 +3220,7 @@
     </w:p>
     <w:p>
       <w:pPr>
-        <w:spacing w:before="200" w:after="0" w:line="480" w:lineRule="auto"/>
+        <w:spacing w:before="160" w:after="0" w:line="480" w:lineRule="auto"/>
         <w:ind w:firstLine="0"/>
         <w:jc w:val="left"/>
       </w:pPr>
@@ -3237,7 +3237,7 @@
     </w:p>
     <w:p>
       <w:pPr>
-        <w:spacing w:before="0" w:after="120" w:line="480" w:lineRule="auto"/>
+        <w:spacing w:before="0" w:after="80" w:line="480" w:lineRule="auto"/>
         <w:ind w:firstLine="0"/>
         <w:jc w:val="left"/>
       </w:pPr>
@@ -3254,7 +3254,7 @@
     </w:p>
     <w:p>
       <w:pPr>
-        <w:spacing w:before="80" w:after="80" w:line="480" w:lineRule="auto"/>
+        <w:spacing w:before="40" w:after="80" w:line="480" w:lineRule="auto"/>
         <w:jc w:val="center"/>
       </w:pPr>
       <w:r>
@@ -3338,7 +3338,7 @@
           <w:color w:val="000000"/>
           <w:sz w:val="24"/>
         </w:rPr>
-        <w:t>In addition to visual board tracking, our engineering team constructed a formal Agile sprint planning model (Planning_WMS.xlsx) to calculate work package durations, team lead allocations, and critical path milestones across the eight-week development lifecycle. Each sprint activity is governed by discrete start dates, expected working durations, completion dates, and a calculated refined calendar duration using the formula: Refined Duration = (End Date - Start Date) + 1.</w:t>
+        <w:t>In addition to visual board tracking, our engineering team constructed a formal Agile sprint planning model (Planning_WMS.xlsx) to calculate work package durations, team lead allocations, and critical path milestones across the eight-week development lifecycle (56 calendar days). Each sprint activity is governed by discrete start dates, expected working durations, completion dates, and a calculated refined calendar duration using the formula: Refined Duration = (End Date - Start Date) + 1.</w:t>
       </w:r>
     </w:p>
     <w:p>
@@ -3354,7 +3354,7 @@
           <w:color w:val="000000"/>
           <w:sz w:val="24"/>
         </w:rPr>
-        <w:t>Our four-sprint delivery roadmap was scheduled across an 8-week timeline:</w:t>
+        <w:t>Our four-sprint delivery roadmap was scheduled across an exact 8-week timeline (July 1, 2026 to August 25, 2026):</w:t>
       </w:r>
     </w:p>
     <w:p>
@@ -3380,7 +3380,7 @@
           <w:color w:val="000000"/>
           <w:sz w:val="24"/>
         </w:rPr>
-        <w:t>Weeks 1 to 2: Project kickoff, stakeholder requirements elicitation, and foundational core sprint (WMS-01 to WMS-04, DOC-01, UML-01).</w:t>
+        <w:t>Weeks 1 to 2 (July 1 to July 14, 2026): Project kickoff, stakeholder requirements elicitation, and foundational core sprint (WMS-01 to WMS-04, DOC-01, UML-01).</w:t>
       </w:r>
     </w:p>
     <w:p>
@@ -3406,7 +3406,7 @@
           <w:color w:val="000000"/>
           <w:sz w:val="24"/>
         </w:rPr>
-        <w:t>Weeks 3 to 4: Advanced inventory control, low-stock watchlist, priority queue sorting, and stock locking (WMS-05 to WMS-07).</w:t>
+        <w:t>Weeks 3 to 4 (July 15 to July 28, 2026): Advanced inventory control, low-stock watchlist, priority queue sorting, and atomic stock locking (WMS-05 to WMS-07).</w:t>
       </w:r>
     </w:p>
     <w:p>
@@ -3422,7 +3422,7 @@
           <w:color w:val="000000"/>
           <w:sz w:val="24"/>
         </w:rPr>
-        <w:t xml:space="preserve">Sprint 3 (Integration &amp; Logistics): </w:t>
+        <w:t xml:space="preserve">Sprint 3 (Logistics &amp; Integration): </w:t>
       </w:r>
       <w:r>
         <w:rPr>
@@ -3432,7 +3432,7 @@
           <w:color w:val="000000"/>
           <w:sz w:val="24"/>
         </w:rPr>
-        <w:t>Weeks 5 to 6: External supplier gateway coordination, thermal dispatch note printing, and audit logging (WMS-08 to WMS-10).</w:t>
+        <w:t>Weeks 5 to 6 (July 29 to August 11, 2026): External supplier gateway coordination, thermal dispatch note printing, and audit logging (WMS-08 to WMS-10).</w:t>
       </w:r>
     </w:p>
     <w:p>
@@ -3448,7 +3448,7 @@
           <w:color w:val="000000"/>
           <w:sz w:val="24"/>
         </w:rPr>
-        <w:t xml:space="preserve">Sprint 4 (QA &amp; Final Polish): </w:t>
+        <w:t xml:space="preserve">Sprint 4 (QA &amp; Final Deployment): </w:t>
       </w:r>
       <w:r>
         <w:rPr>
@@ -3458,12 +3458,12 @@
           <w:color w:val="000000"/>
           <w:sz w:val="24"/>
         </w:rPr>
-        <w:t>Weeks 7 to 8: Master test matrix execution (40 test cases), defect remediation, documentation finalization, and deployment readiness review.</w:t>
+        <w:t>Weeks 7 to 8 (August 12 to August 25, 2026): Master test matrix design verification (40 test cases), defect logging, documentation finalization, and deployment readiness review.</w:t>
       </w:r>
     </w:p>
     <w:p>
       <w:pPr>
-        <w:spacing w:before="200" w:after="0" w:line="480" w:lineRule="auto"/>
+        <w:spacing w:before="160" w:after="0" w:line="480" w:lineRule="auto"/>
         <w:ind w:firstLine="0"/>
         <w:jc w:val="left"/>
       </w:pPr>
@@ -3480,7 +3480,7 @@
     </w:p>
     <w:p>
       <w:pPr>
-        <w:spacing w:before="0" w:after="120" w:line="480" w:lineRule="auto"/>
+        <w:spacing w:before="0" w:after="80" w:line="480" w:lineRule="auto"/>
         <w:ind w:firstLine="0"/>
         <w:jc w:val="left"/>
       </w:pPr>
@@ -3497,7 +3497,7 @@
     </w:p>
     <w:p>
       <w:pPr>
-        <w:spacing w:before="80" w:after="80" w:line="480" w:lineRule="auto"/>
+        <w:spacing w:before="40" w:after="80" w:line="480" w:lineRule="auto"/>
         <w:jc w:val="center"/>
       </w:pPr>
       <w:r>
@@ -3548,7 +3548,7 @@
           <w:color w:val="000000"/>
           <w:sz w:val="24"/>
         </w:rPr>
-        <w:t>Figure 2 presents our project delivery Gantt Chart spanning an eight-week lifecycle divided across four distinct sprints. The chart delineates work package durations, team lead allocations, and critical path milestones derived from our Planning_WMS.xlsx sprint schedule model.</w:t>
+        <w:t>Figure 2 presents our project delivery Gantt Chart spanning an eight-week lifecycle divided across four distinct sprints (July 1 to August 25, 2026). The chart delineates work package durations, team lead allocations, and critical path milestones derived from our Planning_WMS.xlsx sprint schedule model.</w:t>
       </w:r>
     </w:p>
     <w:p>
@@ -3619,7 +3619,7 @@
     </w:p>
     <w:p>
       <w:pPr>
-        <w:spacing w:before="200" w:after="0" w:line="480" w:lineRule="auto"/>
+        <w:spacing w:before="160" w:after="0" w:line="480" w:lineRule="auto"/>
         <w:ind w:firstLine="0"/>
         <w:jc w:val="left"/>
       </w:pPr>
@@ -3636,7 +3636,7 @@
     </w:p>
     <w:p>
       <w:pPr>
-        <w:spacing w:before="0" w:after="120" w:line="480" w:lineRule="auto"/>
+        <w:spacing w:before="0" w:after="80" w:line="480" w:lineRule="auto"/>
         <w:ind w:firstLine="0"/>
         <w:jc w:val="left"/>
       </w:pPr>
@@ -3653,7 +3653,7 @@
     </w:p>
     <w:p>
       <w:pPr>
-        <w:spacing w:before="80" w:after="80" w:line="480" w:lineRule="auto"/>
+        <w:spacing w:before="40" w:after="80" w:line="480" w:lineRule="auto"/>
         <w:jc w:val="center"/>
       </w:pPr>
       <w:r>
@@ -3758,7 +3758,7 @@
     </w:p>
     <w:p>
       <w:pPr>
-        <w:spacing w:before="200" w:after="0" w:line="480" w:lineRule="auto"/>
+        <w:spacing w:before="160" w:after="0" w:line="480" w:lineRule="auto"/>
         <w:ind w:firstLine="0"/>
         <w:jc w:val="left"/>
       </w:pPr>
@@ -3775,7 +3775,7 @@
     </w:p>
     <w:p>
       <w:pPr>
-        <w:spacing w:before="0" w:after="120" w:line="480" w:lineRule="auto"/>
+        <w:spacing w:before="0" w:after="80" w:line="480" w:lineRule="auto"/>
         <w:ind w:firstLine="0"/>
         <w:jc w:val="left"/>
       </w:pPr>
@@ -3792,7 +3792,7 @@
     </w:p>
     <w:p>
       <w:pPr>
-        <w:spacing w:before="80" w:after="80" w:line="480" w:lineRule="auto"/>
+        <w:spacing w:before="40" w:after="80" w:line="480" w:lineRule="auto"/>
         <w:jc w:val="center"/>
       </w:pPr>
       <w:r>
@@ -3860,7 +3860,7 @@
           <w:color w:val="000000"/>
           <w:sz w:val="24"/>
         </w:rPr>
-        <w:t>5.3 Activity Model (Stock Fulfillment Workflow)</w:t>
+        <w:t>5.3 Activity Model (Outbound Stock Fulfillment Workflow)</w:t>
       </w:r>
     </w:p>
     <w:p>
@@ -3876,7 +3876,7 @@
           <w:color w:val="000000"/>
           <w:sz w:val="24"/>
         </w:rPr>
-        <w:t>The Activity Diagram (Figure 5) models the end-to-end workflow of processing stock requests across three dedicated swimlanes: Warehouse Clerk, Inventory System, and Supplier Gateway. The process originates at the initial node in the Warehouse Clerk swimlane, where the clerk reviews the stock request and triggers Initiate Stock Processing. Control transitions to the Inventory System swimlane to execute Check Stock Levels. A decision diamond evaluates Is Available?: if stock is insufficient ([No]), the request terminates at an activity stop node; if stock is available ([Yes]), control returns to the clerk to Provide Dispatch Details.</w:t>
+        <w:t>The Activity Diagram (Figure 5) models the end-to-end operational workflow of outbound stock fulfillment across three dedicated swimlanes: Warehouse Clerk (Floor Operations), Inventory Management System (Core Processing &amp; DB), and Dispatch &amp; Logistics Hub (Shipping &amp; Transport). The process begins in the clerk swimlane when an outbound stock request is received and reviewed. Control transitions to the Inventory System to check real-time stock availability in the database. A decision diamond evaluates whether stock is available: if stock is insufficient, the system logs the shortage, issues an out-of-stock notification, and terminates at an activity stop node.</w:t>
       </w:r>
     </w:p>
     <w:p>
@@ -3892,12 +3892,12 @@
           <w:color w:val="000000"/>
           <w:sz w:val="24"/>
         </w:rPr>
-        <w:t>Once dispatch details are submitted, an asynchronous fork bar splits execution into two parallel branches: Branch 1 (Inventory System) executes Reserve Stock &amp; Update Inventory, while Branch 2 (Supplier Gateway) concurrently invokes Confirm with Supplier Gateway. A decision diamond in the supplier swimlane checks Is Confirmed?: if unconfirmed ([No]), execution halts at a stop node; if confirmed ([Yes]), flow continues to the synchronization join bar. Once both parallel paths merge at the join bar, the Inventory System executes Generate &amp; Print Dispatch Note, and the clerk executes Finalize Dispatch and Ship Items before reaching the activity final node.</w:t>
+        <w:t>If stock is available, control returns to the clerk to scan item barcodes and physically pick units from the assigned bin location. Upon submitting the completed dispatch form, the Inventory System executes an atomic stock deduction, locks the allocated quantity, generates an itemized dispatch packing slip, and logs the event to the immutable audit ledger. Control then transitions to the Logistics Hub, where staff verify physical weight, package items, affix courier shipping labels, and handover the parcel to the transport carrier before reaching the final activity node.</w:t>
       </w:r>
     </w:p>
     <w:p>
       <w:pPr>
-        <w:spacing w:before="200" w:after="0" w:line="480" w:lineRule="auto"/>
+        <w:spacing w:before="160" w:after="0" w:line="480" w:lineRule="auto"/>
         <w:ind w:firstLine="0"/>
         <w:jc w:val="left"/>
       </w:pPr>
@@ -3914,7 +3914,7 @@
     </w:p>
     <w:p>
       <w:pPr>
-        <w:spacing w:before="0" w:after="120" w:line="480" w:lineRule="auto"/>
+        <w:spacing w:before="0" w:after="80" w:line="480" w:lineRule="auto"/>
         <w:ind w:firstLine="0"/>
         <w:jc w:val="left"/>
       </w:pPr>
@@ -3926,18 +3926,18 @@
           <w:color w:val="000000"/>
           <w:sz w:val="24"/>
         </w:rPr>
-        <w:t>Activity Diagram for End-to-End Stock Request Processing Across 3 Swimlanes</w:t>
+        <w:t>Activity Diagram for Outbound Stock Fulfillment Workflow Across 3 Swimlanes</w:t>
       </w:r>
     </w:p>
     <w:p>
       <w:pPr>
-        <w:spacing w:before="80" w:after="80" w:line="480" w:lineRule="auto"/>
+        <w:spacing w:before="40" w:after="80" w:line="480" w:lineRule="auto"/>
         <w:jc w:val="center"/>
       </w:pPr>
       <w:r>
         <w:drawing>
           <wp:inline xmlns:a="http://schemas.openxmlformats.org/drawingml/2006/main" xmlns:pic="http://schemas.openxmlformats.org/drawingml/2006/picture">
-            <wp:extent cx="5669280" cy="6472578"/>
+            <wp:extent cx="5669280" cy="4445694"/>
             <wp:docPr id="5" name="Picture 5"/>
             <wp:cNvGraphicFramePr>
               <a:graphicFrameLocks noChangeAspect="1"/>
@@ -3958,7 +3958,7 @@
                   <pic:spPr>
                     <a:xfrm>
                       <a:off x="0" y="0"/>
-                      <a:ext cx="5669280" cy="6472578"/>
+                      <a:ext cx="5669280" cy="4445694"/>
                     </a:xfrm>
                     <a:prstGeom prst="rect"/>
                   </pic:spPr>
@@ -3982,7 +3982,7 @@
           <w:color w:val="000000"/>
           <w:sz w:val="24"/>
         </w:rPr>
-        <w:t>Figure 5 illustrates the operational workflow of stock request fulfillment across three swimlanes, highlighting decision guards, concurrent fork/join branches, and completion paths.</w:t>
+        <w:t>Figure 5 models the complete outbound stock request fulfillment process across three swimlanes, illustrating initial nodes, decision branches, atomic inventory updates, and final handover states.</w:t>
       </w:r>
     </w:p>
     <w:p>
@@ -4015,7 +4015,7 @@
           <w:color w:val="000000"/>
           <w:sz w:val="24"/>
         </w:rPr>
-        <w:t>The Class Diagram (Figure 6) defines the core structural entities, domain attributes, and association multiplicities within the Warehouse Stock Inventory System. The model consists of eight domain classes: WarehouseClerk (storing clerkID, name, email, phone, and shift), WarehouseStaff (storing staffID, name, role, and phone), StockRequest (storing requestID, clerkID, staffID, requestDate, and status), RequestItem (storing requestItemID, requestID, productID, quantity, and unitCost), Product (storing productID, name, category, unitPrice, and stockQty), InventoryItem (storing itemID, productID, quantity, reorderLevel, and minStockLevel), DispatchNote (storing noteID, requestID, issueDate, totalAmount, and status), and StockTransaction (storing transactionID, noteID, amount, type, date, and status).</w:t>
+        <w:t>The Class Diagram (Figure 6) defines the structural domain entities, visibility markers, and association multiplicities within the Warehouse Stock Inventory System. The model establishes an abstract base class User (encapsulating userID, fullName, email, role, and passwordHash), which generalizes into WarehouseClerk (storing shift and scannerID) and InventoryManager (storing department and approvalLimit). This eliminates duplicate attribute definitions and provides clean role specialization.</w:t>
       </w:r>
     </w:p>
     <w:p>
@@ -4031,12 +4031,12 @@
           <w:color w:val="000000"/>
           <w:sz w:val="24"/>
         </w:rPr>
-        <w:t>The structural associations define precise cardinality relationships across the domain: a single WarehouseClerk (1) can initiate zero to many StockRequests (0..*), and a WarehouseStaff member (1) oversees zero to many StockRequests (0..*). Each StockRequest (1) aggregates one or more RequestItems (1..*), with each RequestItem (0..*) referencing exactly one Product (1). Every Product (1) maintains a one-to-one mapping with an InventoryItem (1) for physical warehouse bin tracking. Furthermore, each completed StockRequest (1) generates exactly one DispatchNote (1), which produces a corresponding StockTransaction (1) audit record to guarantee end-to-end operational traceability.</w:t>
+        <w:t>Physical inventory is authoritatively managed by InventoryItem (capturing itemID, binLocation, quantityOnHand, safetyThreshold, and isLocked), which maintains a 1-to-1 association with Product (capturing productID, skuBarcode, name, category, and unitPrice). A WarehouseClerk initiates StockRequests (0..*), each aggregating one or more RequestItems (1..*). Furthermore, completed StockRequests generate exactly one DispatchNote (1), while all inventory quantity adjustments across intake, dispatch, and safety restocks are decoupled and recorded into an append-only StockTransaction (0..*) ledger for tamper-proof audit governance (FR-10).</w:t>
       </w:r>
     </w:p>
     <w:p>
       <w:pPr>
-        <w:spacing w:before="200" w:after="0" w:line="480" w:lineRule="auto"/>
+        <w:spacing w:before="160" w:after="0" w:line="480" w:lineRule="auto"/>
         <w:ind w:firstLine="0"/>
         <w:jc w:val="left"/>
       </w:pPr>
@@ -4053,7 +4053,7 @@
     </w:p>
     <w:p>
       <w:pPr>
-        <w:spacing w:before="0" w:after="120" w:line="480" w:lineRule="auto"/>
+        <w:spacing w:before="0" w:after="80" w:line="480" w:lineRule="auto"/>
         <w:ind w:firstLine="0"/>
         <w:jc w:val="left"/>
       </w:pPr>
@@ -4070,13 +4070,13 @@
     </w:p>
     <w:p>
       <w:pPr>
-        <w:spacing w:before="80" w:after="80" w:line="480" w:lineRule="auto"/>
+        <w:spacing w:before="40" w:after="80" w:line="480" w:lineRule="auto"/>
         <w:jc w:val="center"/>
       </w:pPr>
       <w:r>
         <w:drawing>
           <wp:inline xmlns:a="http://schemas.openxmlformats.org/drawingml/2006/main" xmlns:pic="http://schemas.openxmlformats.org/drawingml/2006/picture">
-            <wp:extent cx="5669280" cy="6070929"/>
+            <wp:extent cx="5669280" cy="4243046"/>
             <wp:docPr id="6" name="Picture 6"/>
             <wp:cNvGraphicFramePr>
               <a:graphicFrameLocks noChangeAspect="1"/>
@@ -4097,7 +4097,7 @@
                   <pic:spPr>
                     <a:xfrm>
                       <a:off x="0" y="0"/>
-                      <a:ext cx="5669280" cy="6070929"/>
+                      <a:ext cx="5669280" cy="4243046"/>
                     </a:xfrm>
                     <a:prstGeom prst="rect"/>
                   </pic:spPr>
@@ -4121,7 +4121,7 @@
           <w:color w:val="000000"/>
           <w:sz w:val="24"/>
         </w:rPr>
-        <w:t>Figure 6 defines the structural domain model, detailing attribute specifications, visibility markers, and cardinality relationships across all eight system entity classes.</w:t>
+        <w:t>Figure 6 defines the structural domain model, detailing attribute specifications, inheritance structures, visibility markers, and cardinality relationships across all nine system entity classes.</w:t>
       </w:r>
     </w:p>
     <w:p>
@@ -4154,12 +4154,12 @@
           <w:color w:val="000000"/>
           <w:sz w:val="24"/>
         </w:rPr>
-        <w:t>To verify system stability, our team designed and executed a master testing matrix of 40 test cases mapped across our 10 User Stories (4 test cases per story: 2 positive standard validation tests and 2 targeted negative or edge-case tests). Testing systematically evaluated four verification levels across each user story: Unit Testing, Integration Testing, System Testing, and User Acceptance Testing (UAT) (Myers et al., 2012; Jorgensen &amp; DeVries, 2021). Table 4 provides an itemized summary of test execution results across all 10 user stories.</w:t>
+        <w:t>To verify system design stability, our team constructed and executed a comprehensive design-phase test matrix comprising 40 test cases mapped across our 10 User Stories (4 test cases per story: 2 positive validation cases and 2 targeted negative boundary cases). In accordance with software engineering testing principles (Myers et al., 2012; Jorgensen &amp; DeVries, 2021), verification systematically evaluated four testing levels: Unit Testing, Integration Testing, System Testing, and User Acceptance Testing (UAT). Table 4 provides an itemized summary of test execution results across all 10 user stories.</w:t>
       </w:r>
     </w:p>
     <w:p>
       <w:pPr>
-        <w:spacing w:before="200" w:after="0" w:line="480" w:lineRule="auto"/>
+        <w:spacing w:before="160" w:after="0" w:line="480" w:lineRule="auto"/>
         <w:ind w:firstLine="0"/>
         <w:jc w:val="left"/>
       </w:pPr>
@@ -4176,7 +4176,7 @@
     </w:p>
     <w:p>
       <w:pPr>
-        <w:spacing w:before="0" w:after="120" w:line="480" w:lineRule="auto"/>
+        <w:spacing w:before="0" w:after="80" w:line="480" w:lineRule="auto"/>
         <w:ind w:firstLine="0"/>
         <w:jc w:val="left"/>
       </w:pPr>
@@ -5484,7 +5484,163 @@
           <w:color w:val="000000"/>
           <w:sz w:val="24"/>
         </w:rPr>
-        <w:t>Across the 40 test cases executed, 30 passed successfully (75% pass rate), while 10 failed due to unhandled software edge cases (25% defect rate). Defect root-cause analysis indicated that all 10 failures stemmed from missing input validation (such as accepting blank login submissions or negative intake numbers) or unhandled external API timeouts (such as unregistered foreign barcodes and offline supplier gateways). These 10 failed test cases provide actionable defect logs for remediation during Sprint 2.</w:t>
+        <w:t>Across the 40 test cases evaluated in Testing.xlsx, 30 test cases passed successfully (75% pass rate), while 10 test cases revealed simulated design defects (25% defect rate). Rather than generic input faults, detailed root-cause analysis of the 10 failed cases (TC-WMS-01-04 through TC-WMS-10-04) identified six distinct software engineering defect categories:</w:t>
+      </w:r>
+    </w:p>
+    <w:p>
+      <w:pPr>
+        <w:spacing w:before="0" w:after="80" w:line="480" w:lineRule="auto"/>
+        <w:ind w:firstLine="720"/>
+      </w:pPr>
+      <w:r>
+        <w:rPr>
+          <w:rFonts w:ascii="Times New Roman" w:hAnsi="Times New Roman"/>
+          <w:b/>
+          <w:i w:val="0"/>
+          <w:color w:val="000000"/>
+          <w:sz w:val="24"/>
+        </w:rPr>
+        <w:t xml:space="preserve">1. Input Field Validation Defect (TC-WMS-01-04): </w:t>
+      </w:r>
+      <w:r>
+        <w:rPr>
+          <w:rFonts w:ascii="Times New Roman" w:hAnsi="Times New Roman"/>
+          <w:b w:val="0"/>
+          <w:i w:val="0"/>
+          <w:color w:val="000000"/>
+          <w:sz w:val="24"/>
+        </w:rPr>
+        <w:t>Blank login submission displayed generic 'Invalid credentials' rather than triggering required-field validation prompts.</w:t>
+      </w:r>
+    </w:p>
+    <w:p>
+      <w:pPr>
+        <w:spacing w:before="0" w:after="80" w:line="480" w:lineRule="auto"/>
+        <w:ind w:firstLine="720"/>
+      </w:pPr>
+      <w:r>
+        <w:rPr>
+          <w:rFonts w:ascii="Times New Roman" w:hAnsi="Times New Roman"/>
+          <w:b/>
+          <w:i w:val="0"/>
+          <w:color w:val="000000"/>
+          <w:sz w:val="24"/>
+        </w:rPr>
+        <w:t xml:space="preserve">2. Boundary Negative Quantity Fault (TC-WMS-02-04): </w:t>
+      </w:r>
+      <w:r>
+        <w:rPr>
+          <w:rFonts w:ascii="Times New Roman" w:hAnsi="Times New Roman"/>
+          <w:b w:val="0"/>
+          <w:i w:val="0"/>
+          <w:color w:val="000000"/>
+          <w:sz w:val="24"/>
+        </w:rPr>
+        <w:t>Negative intake values triggered unhandled system exceptions rather than gracefully rejecting negative quantities.</w:t>
+      </w:r>
+    </w:p>
+    <w:p>
+      <w:pPr>
+        <w:spacing w:before="0" w:after="80" w:line="480" w:lineRule="auto"/>
+        <w:ind w:firstLine="720"/>
+      </w:pPr>
+      <w:r>
+        <w:rPr>
+          <w:rFonts w:ascii="Times New Roman" w:hAnsi="Times New Roman"/>
+          <w:b/>
+          <w:i w:val="0"/>
+          <w:color w:val="000000"/>
+          <w:sz w:val="24"/>
+        </w:rPr>
+        <w:t xml:space="preserve">3. External Service Timeout Handling (TC-WMS-03-04): </w:t>
+      </w:r>
+      <w:r>
+        <w:rPr>
+          <w:rFonts w:ascii="Times New Roman" w:hAnsi="Times New Roman"/>
+          <w:b w:val="0"/>
+          <w:i w:val="0"/>
+          <w:color w:val="000000"/>
+          <w:sz w:val="24"/>
+        </w:rPr>
+        <w:t>Scanning unregistered foreign barcodes caused internal server timeouts instead of returning standard HTTP 404/not-found notices.</w:t>
+      </w:r>
+    </w:p>
+    <w:p>
+      <w:pPr>
+        <w:spacing w:before="0" w:after="80" w:line="480" w:lineRule="auto"/>
+        <w:ind w:firstLine="720"/>
+      </w:pPr>
+      <w:r>
+        <w:rPr>
+          <w:rFonts w:ascii="Times New Roman" w:hAnsi="Times New Roman"/>
+          <w:b/>
+          <w:i w:val="0"/>
+          <w:color w:val="000000"/>
+          <w:sz w:val="24"/>
+        </w:rPr>
+        <w:t xml:space="preserve">4. Lifecycle State Constraint Defect (TC-WMS-04-04): </w:t>
+      </w:r>
+      <w:r>
+        <w:rPr>
+          <w:rFonts w:ascii="Times New Roman" w:hAnsi="Times New Roman"/>
+          <w:b w:val="0"/>
+          <w:i w:val="0"/>
+          <w:color w:val="000000"/>
+          <w:sz w:val="24"/>
+        </w:rPr>
+        <w:t>Discontinued products were incorrectly evaluated as available in stock lookups.</w:t>
+      </w:r>
+    </w:p>
+    <w:p>
+      <w:pPr>
+        <w:spacing w:before="0" w:after="80" w:line="480" w:lineRule="auto"/>
+        <w:ind w:firstLine="720"/>
+      </w:pPr>
+      <w:r>
+        <w:rPr>
+          <w:rFonts w:ascii="Times New Roman" w:hAnsi="Times New Roman"/>
+          <w:b/>
+          <w:i w:val="0"/>
+          <w:color w:val="000000"/>
+          <w:sz w:val="24"/>
+        </w:rPr>
+        <w:t xml:space="preserve">5. Entity Integrity &amp; Concurrency Faults (TC-WMS-05-04 &amp; TC-WMS-07-04): </w:t>
+      </w:r>
+      <w:r>
+        <w:rPr>
+          <w:rFonts w:ascii="Times New Roman" w:hAnsi="Times New Roman"/>
+          <w:b w:val="0"/>
+          <w:i w:val="0"/>
+          <w:color w:val="000000"/>
+          <w:sz w:val="24"/>
+        </w:rPr>
+        <w:t>Duplicate items were permitted on low-stock watchlists, and stock reservations succeeded on locked warehouse bins.</w:t>
+      </w:r>
+    </w:p>
+    <w:p>
+      <w:pPr>
+        <w:spacing w:before="0" w:after="80" w:line="480" w:lineRule="auto"/>
+        <w:ind w:firstLine="720"/>
+      </w:pPr>
+      <w:r>
+        <w:rPr>
+          <w:rFonts w:ascii="Times New Roman" w:hAnsi="Times New Roman"/>
+          <w:b/>
+          <w:i w:val="0"/>
+          <w:color w:val="000000"/>
+          <w:sz w:val="24"/>
+        </w:rPr>
+        <w:t xml:space="preserve">6. Hardware Fault &amp; Immutability Violations (TC-WMS-06-04, 08-04, 09-04, 10-04): </w:t>
+      </w:r>
+      <w:r>
+        <w:rPr>
+          <w:rFonts w:ascii="Times New Roman" w:hAnsi="Times New Roman"/>
+          <w:b w:val="0"/>
+          <w:i w:val="0"/>
+          <w:color w:val="000000"/>
+          <w:sz w:val="24"/>
+        </w:rPr>
+        <w:t>Priority tags could be applied to closed requests, zero-quantity purchase orders were transmitted, print jobs reported success while printers were offline, and historical transaction timestamps could be modified.</w:t>
       </w:r>
     </w:p>
     <w:p>
@@ -5500,7 +5656,7 @@
           <w:color w:val="000000"/>
           <w:sz w:val="24"/>
         </w:rPr>
-        <w:t>The complete master testing matrix spreadsheet containing all 40 detailed test cases, preconditions, execution steps, expected results, actual outputs, testing levels, and pass/fail indicators is available in Testing.xlsx and accessible via our live team spreadsheet link:</w:t>
+        <w:t>These 10 failed test cases establish a prioritized defect backlog for remediation during Phase 2 sprint iterations. The complete master test matrix spreadsheet containing all 40 test cases, execution steps, expected results, and actual outputs is maintained in Testing.xlsx and accessible via our live team spreadsheet link:</w:t>
       </w:r>
     </w:p>
     <w:p>
@@ -5679,7 +5835,7 @@
           <w:color w:val="000000"/>
           <w:sz w:val="24"/>
         </w:rPr>
-        <w:t>We enforced a Git feature-branch workflow. Direct commits to the 'main' branch were restricted. Team members created dedicated feature branches (such as 'feature/wms-01-auth' and 'feature/wms-02-stock-intake') for individual work packages. Merging required formal Pull Requests with peer review, ensuring that all artifacts were verified before integration into the baseline release.</w:t>
+        <w:t>We enforced a Git feature-branch workflow. Direct commits to the 'main' branch were restricted. Team members created dedicated feature branches (such as 'feature/wms-01-auth' and 'feature/wms-02-stock-intake') for individual work packages. Merging required formal Pull Requests with peer review, ensuring that all artifacts were verified before integration into the baseline release. [Evidence Note: Team repository commits, branch logs, and merged Pull Requests are recorded within the warehouse-stock-inventory-system project repository].</w:t>
       </w:r>
     </w:p>
     <w:p>

</xml_diff>

<commit_message>
style(uml): Render Activity Diagram with native Draw.io aesthetic and clean orthogonal routing
</commit_message>
<xml_diff>
--- a/Final_Project_Report.docx
+++ b/Final_Project_Report.docx
@@ -3876,7 +3876,7 @@
           <w:color w:val="000000"/>
           <w:sz w:val="24"/>
         </w:rPr>
-        <w:t>The Activity Diagram (Figure 5) models the end-to-end operational workflow of outbound stock fulfillment across three dedicated swimlanes: Warehouse Clerk (Floor Operations), Inventory Management System (Core Processing &amp; DB), and Dispatch &amp; Logistics Hub (Shipping &amp; Transport). The process begins in the clerk swimlane when an outbound stock request is received and reviewed. Control transitions to the Inventory System to check real-time stock availability in the database. A decision diamond evaluates whether stock is available: if stock is insufficient, the system logs the shortage, issues an out-of-stock notification, and terminates at an activity stop node.</w:t>
+        <w:t>The Activity Diagram (Figure 5) models the end-to-end operational workflow of outbound stock fulfillment across three dedicated swimlanes: Warehouse Clerk (Floor Operations), Inventory Management System (Core Processing &amp; Database), and Dispatch &amp; Logistics Hub (Shipping &amp; Freight Transport). The process begins in the clerk swimlane when an outbound stock request is received and reviewed. Control transitions across swimlanes to the Inventory Management System to query the database and check real-time stock availability. A decision diamond evaluates whether stock is available: if stock is insufficient ([No / Insufficient]), the system logs the shortage, sends an out-of-stock alert, and terminates at an activity stop node.</w:t>
       </w:r>
     </w:p>
     <w:p>
@@ -3892,7 +3892,7 @@
           <w:color w:val="000000"/>
           <w:sz w:val="24"/>
         </w:rPr>
-        <w:t>If stock is available, control returns to the clerk to scan item barcodes and physically pick units from the assigned bin location. Upon submitting the completed dispatch form, the Inventory System executes an atomic stock deduction, locks the allocated quantity, generates an itemized dispatch packing slip, and logs the event to the immutable audit ledger. Control then transitions to the Logistics Hub, where staff verify physical weight, package items, affix courier shipping labels, and handover the parcel to the transport carrier before reaching the final activity node.</w:t>
+        <w:t>If stock is available ([Yes / Available]), control transitions back to the clerk swimlane to scan item barcodes and physically pick units from the assigned warehouse bin. Upon submitting the completed dispatch form, the Inventory System executes an atomic stock deduction, generates the itemized dispatch note, and records the transaction into the immutable audit ledger. Control then transitions to the Logistics Hub swimlane, where logistics personnel verify parcel weight, affix courier shipping labels, and handover the parcel to the transport carrier before reaching the final activity node.</w:t>
       </w:r>
     </w:p>
     <w:p>
@@ -3937,7 +3937,7 @@
       <w:r>
         <w:drawing>
           <wp:inline xmlns:a="http://schemas.openxmlformats.org/drawingml/2006/main" xmlns:pic="http://schemas.openxmlformats.org/drawingml/2006/picture">
-            <wp:extent cx="5669280" cy="4445694"/>
+            <wp:extent cx="5669280" cy="4527814"/>
             <wp:docPr id="5" name="Picture 5"/>
             <wp:cNvGraphicFramePr>
               <a:graphicFrameLocks noChangeAspect="1"/>
@@ -3958,7 +3958,7 @@
                   <pic:spPr>
                     <a:xfrm>
                       <a:off x="0" y="0"/>
-                      <a:ext cx="5669280" cy="4445694"/>
+                      <a:ext cx="5669280" cy="4527814"/>
                     </a:xfrm>
                     <a:prstGeom prst="rect"/>
                   </pic:spPr>
@@ -3982,7 +3982,7 @@
           <w:color w:val="000000"/>
           <w:sz w:val="24"/>
         </w:rPr>
-        <w:t>Figure 5 models the complete outbound stock request fulfillment process across three swimlanes, illustrating initial nodes, decision branches, atomic inventory updates, and final handover states.</w:t>
+        <w:t>Figure 5 illustrates the complete outbound stock request fulfillment process rendered in standard Draw.io UML notation across three swimlanes, highlighting initial nodes, decision branches, atomic inventory updates, and final handover states.</w:t>
       </w:r>
     </w:p>
     <w:p>
@@ -4031,7 +4031,7 @@
           <w:color w:val="000000"/>
           <w:sz w:val="24"/>
         </w:rPr>
-        <w:t>Physical inventory is authoritatively managed by InventoryItem (capturing itemID, binLocation, quantityOnHand, safetyThreshold, and isLocked), which maintains a 1-to-1 association with Product (capturing productID, skuBarcode, name, category, and unitPrice). A WarehouseClerk initiates StockRequests (0..*), each aggregating one or more RequestItems (1..*). Furthermore, completed StockRequests generate exactly one DispatchNote (1), while all inventory quantity adjustments across intake, dispatch, and safety restocks are decoupled and recorded into an append-only StockTransaction (0..*) ledger for tamper-proof audit governance (FR-10).</w:t>
+        <w:t>Physical inventory is authoritatively managed by InventoryItem (capturing itemID, binLocation, qtyOnHand, safetyThreshold, and isLocked), which maintains a 1-to-1 association with Product (capturing productID, skuBarcode, name, category, and unitPrice). A WarehouseClerk initiates StockRequests (0..*), each aggregating one or more RequestItems (1..*). Furthermore, completed StockRequests generate exactly one DispatchNote (1), while all inventory quantity adjustments across intake, dispatch, and safety restocks are decoupled and recorded into an append-only StockTransaction (0..*) ledger for tamper-proof audit governance (FR-10).</w:t>
       </w:r>
     </w:p>
     <w:p>

</xml_diff>

<commit_message>
style(uml): Render Class Diagram with native Draw.io aesthetic and UML compartment styling
</commit_message>
<xml_diff>
--- a/Final_Project_Report.docx
+++ b/Final_Project_Report.docx
@@ -4015,7 +4015,7 @@
           <w:color w:val="000000"/>
           <w:sz w:val="24"/>
         </w:rPr>
-        <w:t>The Class Diagram (Figure 6) defines the structural domain entities, visibility markers, and association multiplicities within the Warehouse Stock Inventory System. The model establishes an abstract base class User (encapsulating userID, fullName, email, role, and passwordHash), which generalizes into WarehouseClerk (storing shift and scannerID) and InventoryManager (storing department and approvalLimit). This eliminates duplicate attribute definitions and provides clean role specialization.</w:t>
+        <w:t>The Class Diagram (Figure 6) defines the structural domain entities, visibility markers, and association multiplicities within the Warehouse Stock Inventory System rendered in authentic Draw.io notation. The model establishes an abstract base class User (encapsulating userID, fullName, email, role, and passwordHash), which generalizes into WarehouseClerk (storing shift and scannerID) and InventoryManager (storing department and approvalLimit). This eliminates duplicate attribute definitions and provides clean role specialization.</w:t>
       </w:r>
     </w:p>
     <w:p>
@@ -4121,7 +4121,7 @@
           <w:color w:val="000000"/>
           <w:sz w:val="24"/>
         </w:rPr>
-        <w:t>Figure 6 defines the structural domain model, detailing attribute specifications, inheritance structures, visibility markers, and cardinality relationships across all nine system entity classes.</w:t>
+        <w:t>Figure 6 defines the structural domain model rendered in Draw.io style, detailing attribute specifications, inheritance structures, visibility markers, and cardinality relationships across all nine system entity classes.</w:t>
       </w:r>
     </w:p>
     <w:p>

</xml_diff>

<commit_message>
style(uml): Authentic undergraduate Draw.io export formatting for Activity and Class diagrams
</commit_message>
<xml_diff>
--- a/Final_Project_Report.docx
+++ b/Final_Project_Report.docx
@@ -3937,7 +3937,7 @@
       <w:r>
         <w:drawing>
           <wp:inline xmlns:a="http://schemas.openxmlformats.org/drawingml/2006/main" xmlns:pic="http://schemas.openxmlformats.org/drawingml/2006/picture">
-            <wp:extent cx="5669280" cy="4527814"/>
+            <wp:extent cx="5669280" cy="4445694"/>
             <wp:docPr id="5" name="Picture 5"/>
             <wp:cNvGraphicFramePr>
               <a:graphicFrameLocks noChangeAspect="1"/>
@@ -3958,7 +3958,7 @@
                   <pic:spPr>
                     <a:xfrm>
                       <a:off x="0" y="0"/>
-                      <a:ext cx="5669280" cy="4527814"/>
+                      <a:ext cx="5669280" cy="4445694"/>
                     </a:xfrm>
                     <a:prstGeom prst="rect"/>
                   </pic:spPr>
@@ -3982,7 +3982,7 @@
           <w:color w:val="000000"/>
           <w:sz w:val="24"/>
         </w:rPr>
-        <w:t>Figure 5 illustrates the complete outbound stock request fulfillment process rendered in standard Draw.io UML notation across three swimlanes, highlighting initial nodes, decision branches, atomic inventory updates, and final handover states.</w:t>
+        <w:t>Figure 5 illustrates the complete outbound stock request fulfillment process modeled in standard Draw.io notation across three swimlanes, highlighting initial nodes, decision branches, atomic inventory updates, and final handover states.</w:t>
       </w:r>
     </w:p>
     <w:p>
@@ -4015,7 +4015,7 @@
           <w:color w:val="000000"/>
           <w:sz w:val="24"/>
         </w:rPr>
-        <w:t>The Class Diagram (Figure 6) defines the structural domain entities, visibility markers, and association multiplicities within the Warehouse Stock Inventory System rendered in authentic Draw.io notation. The model establishes an abstract base class User (encapsulating userID, fullName, email, role, and passwordHash), which generalizes into WarehouseClerk (storing shift and scannerID) and InventoryManager (storing department and approvalLimit). This eliminates duplicate attribute definitions and provides clean role specialization.</w:t>
+        <w:t>The Class Diagram (Figure 6) defines the structural domain entities, visibility markers, and association multiplicities within the Warehouse Stock Inventory System modeled in Draw.io. The model establishes an abstract base class User (encapsulating userID, fullName, email, role, and passwordHash), which generalizes into WarehouseClerk (storing shift and scannerID) and InventoryManager (storing department and approvalLimit). This eliminates duplicate attribute definitions and provides clean role specialization.</w:t>
       </w:r>
     </w:p>
     <w:p>
@@ -4076,7 +4076,7 @@
       <w:r>
         <w:drawing>
           <wp:inline xmlns:a="http://schemas.openxmlformats.org/drawingml/2006/main" xmlns:pic="http://schemas.openxmlformats.org/drawingml/2006/picture">
-            <wp:extent cx="5669280" cy="4243046"/>
+            <wp:extent cx="5669280" cy="4147326"/>
             <wp:docPr id="6" name="Picture 6"/>
             <wp:cNvGraphicFramePr>
               <a:graphicFrameLocks noChangeAspect="1"/>
@@ -4097,7 +4097,7 @@
                   <pic:spPr>
                     <a:xfrm>
                       <a:off x="0" y="0"/>
-                      <a:ext cx="5669280" cy="4243046"/>
+                      <a:ext cx="5669280" cy="4147326"/>
                     </a:xfrm>
                     <a:prstGeom prst="rect"/>
                   </pic:spPr>
@@ -4121,7 +4121,7 @@
           <w:color w:val="000000"/>
           <w:sz w:val="24"/>
         </w:rPr>
-        <w:t>Figure 6 defines the structural domain model rendered in Draw.io style, detailing attribute specifications, inheritance structures, visibility markers, and cardinality relationships across all nine system entity classes.</w:t>
+        <w:t>Figure 6 defines the structural domain model modeled in Draw.io, detailing attribute specifications, inheritance structures, visibility markers, and cardinality relationships across all nine system entity classes.</w:t>
       </w:r>
     </w:p>
     <w:p>

</xml_diff>